<commit_message>
feat: add cron-job setup script and Mac launchd fallback
Provide one-command cron-job.org provisioning and a local LaunchAgent installer while fixing trigger script line endings and updating scheduling docs.

Co-authored-by: Cursor <cursoragent@cursor.com>
</commit_message>
<xml_diff>
--- a/docs/word/SCHEDULING.en.docx
+++ b/docs/word/SCHEDULING.en.docx
@@ -313,7 +313,7 @@
           <w:b/>
           <w:sz w:val="24"/>
         </w:rPr>
-        <w:t>1.2 Create a job on cron-job.org</w:t>
+        <w:t>1.2 One-command setup (when you have an API key)</w:t>
       </w:r>
     </w:p>
     <w:p>
@@ -333,7 +333,37 @@
           <w:color w:val="0563C1"/>
           <w:sz w:val="22"/>
         </w:rPr>
-        <w:t>https://cron-job.org (https://cron-job.org)</w:t>
+        <w:t>cron-job.org (https://cron-job.org)</w:t>
+      </w:r>
+      <w:r>
+        <w:rPr>
+          <w:rFonts w:ascii="Calibri" w:hAnsi="Calibri" w:eastAsia="Microsoft JhengHei"/>
+          <w:sz w:val="22"/>
+        </w:rPr>
+        <w:t xml:space="preserve"> → copy </w:t>
+      </w:r>
+      <w:r>
+        <w:rPr>
+          <w:rFonts w:ascii="Calibri" w:hAnsi="Calibri" w:eastAsia="Microsoft JhengHei"/>
+          <w:b/>
+          <w:sz w:val="22"/>
+        </w:rPr>
+        <w:t>API Key</w:t>
+      </w:r>
+      <w:r>
+        <w:rPr>
+          <w:rFonts w:ascii="Calibri" w:hAnsi="Calibri" w:eastAsia="Microsoft JhengHei"/>
+          <w:sz w:val="22"/>
+        </w:rPr>
+        <w:t xml:space="preserve"> from </w:t>
+      </w:r>
+      <w:r>
+        <w:rPr>
+          <w:rFonts w:ascii="Calibri" w:hAnsi="Calibri" w:eastAsia="Microsoft JhengHei"/>
+          <w:b/>
+          <w:sz w:val="22"/>
+        </w:rPr>
+        <w:t>Settings</w:t>
       </w:r>
     </w:p>
     <w:p>
@@ -345,7 +375,132 @@
           <w:rFonts w:ascii="Calibri" w:hAnsi="Calibri" w:eastAsia="Microsoft JhengHei"/>
           <w:sz w:val="22"/>
         </w:rPr>
-        <w:t>Create a cronjob:</w:t>
+        <w:t xml:space="preserve">Run locally (GitHub token uses </w:t>
+      </w:r>
+      <w:r>
+        <w:rPr>
+          <w:rFonts w:ascii="Consolas" w:hAnsi="Consolas" w:eastAsia="Consolas"/>
+          <w:color w:val="333333"/>
+          <w:sz w:val="22"/>
+        </w:rPr>
+        <w:t>gh auth token</w:t>
+      </w:r>
+      <w:r>
+        <w:rPr>
+          <w:rFonts w:ascii="Calibri" w:hAnsi="Calibri" w:eastAsia="Microsoft JhengHei"/>
+          <w:sz w:val="22"/>
+        </w:rPr>
+        <w:t xml:space="preserve"> automatically):</w:t>
+      </w:r>
+    </w:p>
+    <w:p>
+      <w:pPr>
+        <w:spacing w:before="120" w:after="120"/>
+        <w:ind w:left="288"/>
+        <w:shd w:fill="F5F5F5" w:val="clear"/>
+      </w:pPr>
+      <w:r>
+        <w:rPr>
+          <w:rFonts w:ascii="Consolas" w:hAnsi="Consolas" w:eastAsia="Consolas"/>
+          <w:sz w:val="18"/>
+        </w:rPr>
+        <w:t>export CRONJOB_API_KEY="your_cron_job_api_key"</w:t>
+        <w:br/>
+        <w:t>python3 scripts/setup_cron_job.py</w:t>
+      </w:r>
+    </w:p>
+    <w:p>
+      <w:r>
+        <w:rPr>
+          <w:rFonts w:ascii="Calibri" w:hAnsi="Calibri" w:eastAsia="Microsoft JhengHei"/>
+          <w:sz w:val="22"/>
+        </w:rPr>
+        <w:t>Creates two weekday jobs:</w:t>
+      </w:r>
+    </w:p>
+    <w:p>
+      <w:pPr>
+        <w:pStyle w:val="ListBullet"/>
+      </w:pPr>
+      <w:r>
+        <w:rPr>
+          <w:rFonts w:ascii="Calibri" w:hAnsi="Calibri" w:eastAsia="Microsoft JhengHei"/>
+          <w:b/>
+          <w:sz w:val="22"/>
+        </w:rPr>
+        <w:t>09:10–16:10</w:t>
+      </w:r>
+      <w:r>
+        <w:rPr>
+          <w:rFonts w:ascii="Calibri" w:hAnsi="Calibri" w:eastAsia="Microsoft JhengHei"/>
+          <w:sz w:val="22"/>
+        </w:rPr>
+        <w:t xml:space="preserve"> hourly</w:t>
+      </w:r>
+    </w:p>
+    <w:p>
+      <w:pPr>
+        <w:pStyle w:val="ListBullet"/>
+      </w:pPr>
+      <w:r>
+        <w:rPr>
+          <w:rFonts w:ascii="Calibri" w:hAnsi="Calibri" w:eastAsia="Microsoft JhengHei"/>
+          <w:b/>
+          <w:sz w:val="22"/>
+        </w:rPr>
+        <w:t>18:30</w:t>
+      </w:r>
+      <w:r>
+        <w:rPr>
+          <w:rFonts w:ascii="Calibri" w:hAnsi="Calibri" w:eastAsia="Microsoft JhengHei"/>
+          <w:sz w:val="22"/>
+        </w:rPr>
+        <w:t xml:space="preserve"> evening catch-up</w:t>
+      </w:r>
+    </w:p>
+    <w:p>
+      <w:r>
+        <w:rPr>
+          <w:rFonts w:ascii="Calibri" w:hAnsi="Calibri" w:eastAsia="Microsoft JhengHei"/>
+          <w:sz w:val="22"/>
+        </w:rPr>
+        <w:t>Preview without creating:</w:t>
+      </w:r>
+    </w:p>
+    <w:p>
+      <w:pPr>
+        <w:spacing w:before="120" w:after="120"/>
+        <w:ind w:left="288"/>
+        <w:shd w:fill="F5F5F5" w:val="clear"/>
+      </w:pPr>
+      <w:r>
+        <w:rPr>
+          <w:rFonts w:ascii="Consolas" w:hAnsi="Consolas" w:eastAsia="Consolas"/>
+          <w:sz w:val="18"/>
+        </w:rPr>
+        <w:t>python3 scripts/setup_cron_job.py --dry-run</w:t>
+      </w:r>
+    </w:p>
+    <w:p>
+      <w:pPr>
+        <w:pStyle w:val="Heading3"/>
+      </w:pPr>
+      <w:r>
+        <w:rPr>
+          <w:rFonts w:ascii="Calibri" w:hAnsi="Calibri" w:eastAsia="Microsoft JhengHei"/>
+          <w:b/>
+          <w:sz w:val="24"/>
+        </w:rPr>
+        <w:t>1.3 Manual setup on cron-job.org (optional)</w:t>
+      </w:r>
+    </w:p>
+    <w:p>
+      <w:r>
+        <w:rPr>
+          <w:rFonts w:ascii="Calibri" w:hAnsi="Calibri" w:eastAsia="Microsoft JhengHei"/>
+          <w:sz w:val="22"/>
+        </w:rPr>
+        <w:t>If you prefer the web UI:</w:t>
       </w:r>
     </w:p>
     <w:tbl>
@@ -745,7 +900,82 @@
           <w:b/>
           <w:sz w:val="28"/>
         </w:rPr>
-        <w:t>2. Local / server trigger</w:t>
+        <w:t>2. Local Mac fallback (installable)</w:t>
+      </w:r>
+    </w:p>
+    <w:p>
+      <w:r>
+        <w:rPr>
+          <w:rFonts w:ascii="Calibri" w:hAnsi="Calibri" w:eastAsia="Microsoft JhengHei"/>
+          <w:sz w:val="22"/>
+        </w:rPr>
+        <w:t xml:space="preserve">If your Mac is usually on, install a LaunchAgent (uses </w:t>
+      </w:r>
+      <w:r>
+        <w:rPr>
+          <w:rFonts w:ascii="Consolas" w:hAnsi="Consolas" w:eastAsia="Consolas"/>
+          <w:color w:val="333333"/>
+          <w:sz w:val="22"/>
+        </w:rPr>
+        <w:t>gh auth</w:t>
+      </w:r>
+      <w:r>
+        <w:rPr>
+          <w:rFonts w:ascii="Calibri" w:hAnsi="Calibri" w:eastAsia="Microsoft JhengHei"/>
+          <w:sz w:val="22"/>
+        </w:rPr>
+        <w:t>, no extra token):</w:t>
+      </w:r>
+    </w:p>
+    <w:p>
+      <w:pPr>
+        <w:spacing w:before="120" w:after="120"/>
+        <w:ind w:left="288"/>
+        <w:shd w:fill="F5F5F5" w:val="clear"/>
+      </w:pPr>
+      <w:r>
+        <w:rPr>
+          <w:rFonts w:ascii="Consolas" w:hAnsi="Consolas" w:eastAsia="Consolas"/>
+          <w:sz w:val="18"/>
+        </w:rPr>
+        <w:t>./scripts/install_launchd.sh</w:t>
+      </w:r>
+    </w:p>
+    <w:p>
+      <w:r>
+        <w:rPr>
+          <w:rFonts w:ascii="Calibri" w:hAnsi="Calibri" w:eastAsia="Microsoft JhengHei"/>
+          <w:sz w:val="22"/>
+        </w:rPr>
+        <w:t xml:space="preserve">Runs on weekdays at 09:10–16:10 and 18:30. Log: </w:t>
+      </w:r>
+      <w:r>
+        <w:rPr>
+          <w:rFonts w:ascii="Consolas" w:hAnsi="Consolas" w:eastAsia="Consolas"/>
+          <w:color w:val="333333"/>
+          <w:sz w:val="22"/>
+        </w:rPr>
+        <w:t>/tmp/bot-fx-trigger.log</w:t>
+      </w:r>
+    </w:p>
+    <w:p>
+      <w:pPr>
+        <w:pBdr>
+          <w:bottom w:val="single" w:sz="6" w:space="1" w:color="AAAAAA"/>
+        </w:pBdr>
+      </w:pPr>
+    </w:p>
+    <w:p>
+      <w:pPr>
+        <w:pStyle w:val="Heading2"/>
+      </w:pPr>
+      <w:r>
+        <w:rPr>
+          <w:rFonts w:ascii="Calibri" w:hAnsi="Calibri" w:eastAsia="Microsoft JhengHei"/>
+          <w:b/>
+          <w:sz w:val="28"/>
+        </w:rPr>
+        <w:t>3. Local / server crontab</w:t>
       </w:r>
     </w:p>
     <w:p>
@@ -818,7 +1048,7 @@
           <w:b/>
           <w:sz w:val="28"/>
         </w:rPr>
-        <w:t>3. GitHub backup schedule</w:t>
+        <w:t>4. GitHub backup schedule</w:t>
       </w:r>
     </w:p>
     <w:tbl>
@@ -1068,7 +1298,7 @@
           <w:b/>
           <w:sz w:val="28"/>
         </w:rPr>
-        <w:t>4. Troubleshooting</w:t>
+        <w:t>5. Troubleshooting</w:t>
       </w:r>
     </w:p>
     <w:tbl>
@@ -1262,7 +1492,7 @@
           <w:b/>
           <w:sz w:val="28"/>
         </w:rPr>
-        <w:t>5. Related files</w:t>
+        <w:t>6. Related files</w:t>
       </w:r>
     </w:p>
     <w:p>
@@ -1289,6 +1519,46 @@
           <w:sz w:val="22"/>
         </w:rPr>
         <w:t>scripts/trigger_update.sh</w:t>
+      </w:r>
+    </w:p>
+    <w:p>
+      <w:pPr>
+        <w:pStyle w:val="ListBullet"/>
+      </w:pPr>
+      <w:r>
+        <w:rPr>
+          <w:rFonts w:ascii="Consolas" w:hAnsi="Consolas" w:eastAsia="Consolas"/>
+          <w:color w:val="333333"/>
+          <w:sz w:val="22"/>
+        </w:rPr>
+        <w:t>scripts/setup_cron_job.py</w:t>
+      </w:r>
+      <w:r>
+        <w:rPr>
+          <w:rFonts w:ascii="Calibri" w:hAnsi="Calibri" w:eastAsia="Microsoft JhengHei"/>
+          <w:sz w:val="22"/>
+        </w:rPr>
+        <w:t xml:space="preserve"> (one-click cron-job.org setup)</w:t>
+      </w:r>
+    </w:p>
+    <w:p>
+      <w:pPr>
+        <w:pStyle w:val="ListBullet"/>
+      </w:pPr>
+      <w:r>
+        <w:rPr>
+          <w:rFonts w:ascii="Consolas" w:hAnsi="Consolas" w:eastAsia="Consolas"/>
+          <w:color w:val="333333"/>
+          <w:sz w:val="22"/>
+        </w:rPr>
+        <w:t>scripts/install_launchd.sh</w:t>
+      </w:r>
+      <w:r>
+        <w:rPr>
+          <w:rFonts w:ascii="Calibri" w:hAnsi="Calibri" w:eastAsia="Microsoft JhengHei"/>
+          <w:sz w:val="22"/>
+        </w:rPr>
+        <w:t xml:space="preserve"> (Mac local fallback)</w:t>
       </w:r>
     </w:p>
     <w:p>

</xml_diff>

<commit_message>
docs: document schedule layers and troubleshooting runbooks
Add current cron overview, step-by-step triage when jobs do not run, and refresh user guide FAQ plus Word/PDF exports.

Co-authored-by: Cursor <cursoragent@cursor.com>
</commit_message>
<xml_diff>
--- a/docs/word/SCHEDULING.en.docx
+++ b/docs/word/SCHEDULING.en.docx
@@ -98,7 +98,7 @@
           <w:rFonts w:ascii="Calibri" w:hAnsi="Calibri" w:eastAsia="Microsoft JhengHei"/>
           <w:sz w:val="22"/>
         </w:rPr>
-        <w:t xml:space="preserve"> an external cron service calling the GitHub API (</w:t>
+        <w:t xml:space="preserve"> external cron (cron-job.org) calling the GitHub API (</w:t>
       </w:r>
       <w:r>
         <w:rPr>
@@ -146,6 +146,26 @@
           <w:b/>
           <w:sz w:val="22"/>
         </w:rPr>
+        <w:t>Local (optional):</w:t>
+      </w:r>
+      <w:r>
+        <w:rPr>
+          <w:rFonts w:ascii="Calibri" w:hAnsi="Calibri" w:eastAsia="Microsoft JhengHei"/>
+          <w:sz w:val="22"/>
+        </w:rPr>
+        <w:t xml:space="preserve"> Mac LaunchAgent (only when the Mac is on)</w:t>
+      </w:r>
+    </w:p>
+    <w:p>
+      <w:pPr>
+        <w:pStyle w:val="ListNumber"/>
+      </w:pPr>
+      <w:r>
+        <w:rPr>
+          <w:rFonts w:ascii="Calibri" w:hAnsi="Calibri" w:eastAsia="Microsoft JhengHei"/>
+          <w:b/>
+          <w:sz w:val="22"/>
+        </w:rPr>
         <w:t>Manual:</w:t>
       </w:r>
       <w:r>
@@ -162,6 +182,1490 @@
           <w:sz w:val="22"/>
         </w:rPr>
         <w:t>scripts/trigger_update.sh</w:t>
+      </w:r>
+    </w:p>
+    <w:p>
+      <w:pPr>
+        <w:pBdr>
+          <w:bottom w:val="single" w:sz="6" w:space="1" w:color="AAAAAA"/>
+        </w:pBdr>
+      </w:pPr>
+    </w:p>
+    <w:p>
+      <w:pPr>
+        <w:pStyle w:val="Heading2"/>
+      </w:pPr>
+      <w:r>
+        <w:rPr>
+          <w:rFonts w:ascii="Calibri" w:hAnsi="Calibri" w:eastAsia="Microsoft JhengHei"/>
+          <w:b/>
+          <w:sz w:val="28"/>
+        </w:rPr>
+        <w:t>0. Current schedule overview (Taiwan time, Mon–Fri)</w:t>
+      </w:r>
+    </w:p>
+    <w:tbl>
+      <w:tblPr>
+        <w:tblStyle w:val="TableGrid"/>
+        <w:tblW w:type="auto" w:w="0"/>
+        <w:tblLook w:firstColumn="1" w:firstRow="1" w:lastColumn="0" w:lastRow="0" w:noHBand="0" w:noVBand="1" w:val="04A0"/>
+      </w:tblPr>
+      <w:tblGrid>
+        <w:gridCol w:w="2412"/>
+        <w:gridCol w:w="2412"/>
+        <w:gridCol w:w="2412"/>
+        <w:gridCol w:w="2412"/>
+      </w:tblGrid>
+      <w:tr>
+        <w:tc>
+          <w:tcPr>
+            <w:tcW w:type="dxa" w:w="2412"/>
+          </w:tcPr>
+          <w:p>
+            <w:r/>
+            <w:r>
+              <w:rPr>
+                <w:rFonts w:ascii="Calibri" w:hAnsi="Calibri" w:eastAsia="Microsoft JhengHei"/>
+                <w:b/>
+                <w:sz w:val="20"/>
+              </w:rPr>
+              <w:t>Layer</w:t>
+            </w:r>
+          </w:p>
+        </w:tc>
+        <w:tc>
+          <w:tcPr>
+            <w:tcW w:type="dxa" w:w="2412"/>
+          </w:tcPr>
+          <w:p>
+            <w:r/>
+            <w:r>
+              <w:rPr>
+                <w:rFonts w:ascii="Calibri" w:hAnsi="Calibri" w:eastAsia="Microsoft JhengHei"/>
+                <w:b/>
+                <w:sz w:val="20"/>
+              </w:rPr>
+              <w:t>Source</w:t>
+            </w:r>
+          </w:p>
+        </w:tc>
+        <w:tc>
+          <w:tcPr>
+            <w:tcW w:type="dxa" w:w="2412"/>
+          </w:tcPr>
+          <w:p>
+            <w:r/>
+            <w:r>
+              <w:rPr>
+                <w:rFonts w:ascii="Calibri" w:hAnsi="Calibri" w:eastAsia="Microsoft JhengHei"/>
+                <w:b/>
+                <w:sz w:val="20"/>
+              </w:rPr>
+              <w:t>Times</w:t>
+            </w:r>
+          </w:p>
+        </w:tc>
+        <w:tc>
+          <w:tcPr>
+            <w:tcW w:type="dxa" w:w="2412"/>
+          </w:tcPr>
+          <w:p>
+            <w:r/>
+            <w:r>
+              <w:rPr>
+                <w:rFonts w:ascii="Calibri" w:hAnsi="Calibri" w:eastAsia="Microsoft JhengHei"/>
+                <w:b/>
+                <w:sz w:val="20"/>
+              </w:rPr>
+              <w:t>Notes</w:t>
+            </w:r>
+          </w:p>
+        </w:tc>
+      </w:tr>
+      <w:tr>
+        <w:tc>
+          <w:tcPr>
+            <w:tcW w:type="dxa" w:w="2412"/>
+          </w:tcPr>
+          <w:p>
+            <w:r/>
+            <w:r>
+              <w:rPr>
+                <w:rFonts w:ascii="Calibri" w:hAnsi="Calibri" w:eastAsia="Microsoft JhengHei"/>
+                <w:sz w:val="20"/>
+              </w:rPr>
+              <w:t>Primary</w:t>
+            </w:r>
+          </w:p>
+        </w:tc>
+        <w:tc>
+          <w:tcPr>
+            <w:tcW w:type="dxa" w:w="2412"/>
+          </w:tcPr>
+          <w:p>
+            <w:r/>
+            <w:r>
+              <w:rPr>
+                <w:rFonts w:ascii="Calibri" w:hAnsi="Calibri" w:eastAsia="Microsoft JhengHei"/>
+                <w:sz w:val="20"/>
+              </w:rPr>
+              <w:t>cron-job.org</w:t>
+            </w:r>
+          </w:p>
+        </w:tc>
+        <w:tc>
+          <w:tcPr>
+            <w:tcW w:type="dxa" w:w="2412"/>
+          </w:tcPr>
+          <w:p>
+            <w:r/>
+            <w:r>
+              <w:rPr>
+                <w:rFonts w:ascii="Calibri" w:hAnsi="Calibri" w:eastAsia="Microsoft JhengHei"/>
+                <w:sz w:val="20"/>
+              </w:rPr>
+              <w:t>09:10–16:10 hourly, 18:30</w:t>
+            </w:r>
+          </w:p>
+        </w:tc>
+        <w:tc>
+          <w:tcPr>
+            <w:tcW w:type="dxa" w:w="2412"/>
+          </w:tcPr>
+          <w:p>
+            <w:r/>
+            <w:r>
+              <w:rPr>
+                <w:rFonts w:ascii="Calibri" w:hAnsi="Calibri" w:eastAsia="Microsoft JhengHei"/>
+                <w:sz w:val="20"/>
+              </w:rPr>
+              <w:t>Jobs 8253638 (business hours), 8253639 (evening)</w:t>
+            </w:r>
+          </w:p>
+        </w:tc>
+      </w:tr>
+      <w:tr>
+        <w:tc>
+          <w:tcPr>
+            <w:tcW w:type="dxa" w:w="2412"/>
+          </w:tcPr>
+          <w:p>
+            <w:r/>
+            <w:r>
+              <w:rPr>
+                <w:rFonts w:ascii="Calibri" w:hAnsi="Calibri" w:eastAsia="Microsoft JhengHei"/>
+                <w:sz w:val="20"/>
+              </w:rPr>
+              <w:t>Backup</w:t>
+            </w:r>
+          </w:p>
+        </w:tc>
+        <w:tc>
+          <w:tcPr>
+            <w:tcW w:type="dxa" w:w="2412"/>
+          </w:tcPr>
+          <w:p>
+            <w:r/>
+            <w:r>
+              <w:rPr>
+                <w:rFonts w:ascii="Calibri" w:hAnsi="Calibri" w:eastAsia="Microsoft JhengHei"/>
+                <w:sz w:val="20"/>
+              </w:rPr>
+              <w:t>GitHub schedule</w:t>
+            </w:r>
+          </w:p>
+        </w:tc>
+        <w:tc>
+          <w:tcPr>
+            <w:tcW w:type="dxa" w:w="2412"/>
+          </w:tcPr>
+          <w:p>
+            <w:r/>
+            <w:r>
+              <w:rPr>
+                <w:rFonts w:ascii="Calibri" w:hAnsi="Calibri" w:eastAsia="Microsoft JhengHei"/>
+                <w:sz w:val="20"/>
+              </w:rPr>
+              <w:t>10:30, 15:30, 18:30</w:t>
+            </w:r>
+          </w:p>
+        </w:tc>
+        <w:tc>
+          <w:tcPr>
+            <w:tcW w:type="dxa" w:w="2412"/>
+          </w:tcPr>
+          <w:p>
+            <w:r/>
+            <w:r>
+              <w:rPr>
+                <w:rFonts w:ascii="Calibri" w:hAnsi="Calibri" w:eastAsia="Microsoft JhengHei"/>
+                <w:sz w:val="20"/>
+              </w:rPr>
+              <w:t>Fallback only; do not rely on it</w:t>
+            </w:r>
+          </w:p>
+        </w:tc>
+      </w:tr>
+      <w:tr>
+        <w:tc>
+          <w:tcPr>
+            <w:tcW w:type="dxa" w:w="2412"/>
+          </w:tcPr>
+          <w:p>
+            <w:r/>
+            <w:r>
+              <w:rPr>
+                <w:rFonts w:ascii="Calibri" w:hAnsi="Calibri" w:eastAsia="Microsoft JhengHei"/>
+                <w:sz w:val="20"/>
+              </w:rPr>
+              <w:t>Local</w:t>
+            </w:r>
+          </w:p>
+        </w:tc>
+        <w:tc>
+          <w:tcPr>
+            <w:tcW w:type="dxa" w:w="2412"/>
+          </w:tcPr>
+          <w:p>
+            <w:r/>
+            <w:r>
+              <w:rPr>
+                <w:rFonts w:ascii="Calibri" w:hAnsi="Calibri" w:eastAsia="Microsoft JhengHei"/>
+                <w:sz w:val="20"/>
+              </w:rPr>
+              <w:t>Mac LaunchAgent</w:t>
+            </w:r>
+          </w:p>
+        </w:tc>
+        <w:tc>
+          <w:tcPr>
+            <w:tcW w:type="dxa" w:w="2412"/>
+          </w:tcPr>
+          <w:p>
+            <w:r/>
+            <w:r>
+              <w:rPr>
+                <w:rFonts w:ascii="Calibri" w:hAnsi="Calibri" w:eastAsia="Microsoft JhengHei"/>
+                <w:sz w:val="20"/>
+              </w:rPr>
+              <w:t>same as primary</w:t>
+            </w:r>
+          </w:p>
+        </w:tc>
+        <w:tc>
+          <w:tcPr>
+            <w:tcW w:type="dxa" w:w="2412"/>
+          </w:tcPr>
+          <w:p>
+            <w:r/>
+            <w:r>
+              <w:rPr>
+                <w:rFonts w:ascii="Calibri" w:hAnsi="Calibri" w:eastAsia="Microsoft JhengHei"/>
+                <w:sz w:val="20"/>
+              </w:rPr>
+              <w:t>after ./scripts/install_launchd.sh; Mac must be on</w:t>
+            </w:r>
+          </w:p>
+        </w:tc>
+      </w:tr>
+      <w:tr>
+        <w:tc>
+          <w:tcPr>
+            <w:tcW w:type="dxa" w:w="2412"/>
+          </w:tcPr>
+          <w:p>
+            <w:r/>
+            <w:r>
+              <w:rPr>
+                <w:rFonts w:ascii="Calibri" w:hAnsi="Calibri" w:eastAsia="Microsoft JhengHei"/>
+                <w:sz w:val="20"/>
+              </w:rPr>
+              <w:t>Manual</w:t>
+            </w:r>
+          </w:p>
+        </w:tc>
+        <w:tc>
+          <w:tcPr>
+            <w:tcW w:type="dxa" w:w="2412"/>
+          </w:tcPr>
+          <w:p>
+            <w:r/>
+            <w:r>
+              <w:rPr>
+                <w:rFonts w:ascii="Calibri" w:hAnsi="Calibri" w:eastAsia="Microsoft JhengHei"/>
+                <w:sz w:val="20"/>
+              </w:rPr>
+              <w:t>local / Actions</w:t>
+            </w:r>
+          </w:p>
+        </w:tc>
+        <w:tc>
+          <w:tcPr>
+            <w:tcW w:type="dxa" w:w="2412"/>
+          </w:tcPr>
+          <w:p>
+            <w:r/>
+            <w:r>
+              <w:rPr>
+                <w:rFonts w:ascii="Calibri" w:hAnsi="Calibri" w:eastAsia="Microsoft JhengHei"/>
+                <w:sz w:val="20"/>
+              </w:rPr>
+              <w:t>anytime</w:t>
+            </w:r>
+          </w:p>
+        </w:tc>
+        <w:tc>
+          <w:tcPr>
+            <w:tcW w:type="dxa" w:w="2412"/>
+          </w:tcPr>
+          <w:p>
+            <w:r/>
+            <w:r>
+              <w:rPr>
+                <w:rFonts w:ascii="Calibri" w:hAnsi="Calibri" w:eastAsia="Microsoft JhengHei"/>
+                <w:sz w:val="20"/>
+              </w:rPr>
+              <w:t>./scripts/trigger_update.sh or Run workflow</w:t>
+            </w:r>
+          </w:p>
+        </w:tc>
+      </w:tr>
+    </w:tbl>
+    <w:p/>
+    <w:p>
+      <w:r>
+        <w:rPr>
+          <w:rFonts w:ascii="Calibri" w:hAnsi="Calibri" w:eastAsia="Microsoft JhengHei"/>
+          <w:sz w:val="22"/>
+        </w:rPr>
+        <w:t>Monitor:</w:t>
+      </w:r>
+    </w:p>
+    <w:p>
+      <w:pPr>
+        <w:pStyle w:val="ListBullet"/>
+      </w:pPr>
+      <w:r>
+        <w:rPr>
+          <w:rFonts w:ascii="Calibri" w:hAnsi="Calibri" w:eastAsia="Microsoft JhengHei"/>
+          <w:sz w:val="22"/>
+        </w:rPr>
+        <w:t>Actions: https://github.com/ChesleyLo/DownloadBankOfTaiwanExchangeRate/actions</w:t>
+      </w:r>
+    </w:p>
+    <w:p>
+      <w:pPr>
+        <w:pStyle w:val="ListBullet"/>
+      </w:pPr>
+      <w:r>
+        <w:rPr>
+          <w:rFonts w:ascii="Calibri" w:hAnsi="Calibri" w:eastAsia="Microsoft JhengHei"/>
+          <w:sz w:val="22"/>
+        </w:rPr>
+        <w:t>cron-job.org: https://console.cron-job.org/jobs</w:t>
+      </w:r>
+    </w:p>
+    <w:p>
+      <w:pPr>
+        <w:pBdr>
+          <w:bottom w:val="single" w:sz="6" w:space="1" w:color="AAAAAA"/>
+        </w:pBdr>
+      </w:pPr>
+    </w:p>
+    <w:p>
+      <w:pPr>
+        <w:pStyle w:val="Heading2"/>
+      </w:pPr>
+      <w:r>
+        <w:rPr>
+          <w:rFonts w:ascii="Calibri" w:hAnsi="Calibri" w:eastAsia="Microsoft JhengHei"/>
+          <w:b/>
+          <w:sz w:val="28"/>
+        </w:rPr>
+        <w:t>0.1 What each run does</w:t>
+      </w:r>
+    </w:p>
+    <w:p>
+      <w:pPr>
+        <w:pStyle w:val="ListNumber"/>
+      </w:pPr>
+      <w:r>
+        <w:rPr>
+          <w:rFonts w:ascii="Calibri" w:hAnsi="Calibri" w:eastAsia="Microsoft JhengHei"/>
+          <w:sz w:val="22"/>
+        </w:rPr>
+        <w:t>Download BOT CSV → convert to JSON</w:t>
+      </w:r>
+    </w:p>
+    <w:p>
+      <w:pPr>
+        <w:pStyle w:val="ListNumber"/>
+      </w:pPr>
+      <w:r>
+        <w:rPr>
+          <w:rFonts w:ascii="Calibri" w:hAnsi="Calibri" w:eastAsia="Microsoft JhengHei"/>
+          <w:sz w:val="22"/>
+        </w:rPr>
+        <w:t xml:space="preserve">Write </w:t>
+      </w:r>
+      <w:r>
+        <w:rPr>
+          <w:rFonts w:ascii="Consolas" w:hAnsi="Consolas" w:eastAsia="Consolas"/>
+          <w:color w:val="333333"/>
+          <w:sz w:val="22"/>
+        </w:rPr>
+        <w:t>data/bot-xrt-latest.*</w:t>
+      </w:r>
+      <w:r>
+        <w:rPr>
+          <w:rFonts w:ascii="Calibri" w:hAnsi="Calibri" w:eastAsia="Microsoft JhengHei"/>
+          <w:sz w:val="22"/>
+        </w:rPr>
+        <w:t xml:space="preserve">; archives under </w:t>
+      </w:r>
+      <w:r>
+        <w:rPr>
+          <w:rFonts w:ascii="Consolas" w:hAnsi="Consolas" w:eastAsia="Consolas"/>
+          <w:color w:val="333333"/>
+          <w:sz w:val="22"/>
+        </w:rPr>
+        <w:t>data/history/</w:t>
+      </w:r>
+      <w:r>
+        <w:rPr>
+          <w:rFonts w:ascii="Calibri" w:hAnsi="Calibri" w:eastAsia="Microsoft JhengHei"/>
+          <w:sz w:val="22"/>
+        </w:rPr>
+        <w:t xml:space="preserve"> (90-day retention)</w:t>
+      </w:r>
+    </w:p>
+    <w:p>
+      <w:pPr>
+        <w:pStyle w:val="ListNumber"/>
+      </w:pPr>
+      <w:r>
+        <w:rPr>
+          <w:rFonts w:ascii="Calibri" w:hAnsi="Calibri" w:eastAsia="Microsoft JhengHei"/>
+          <w:b/>
+          <w:sz w:val="22"/>
+        </w:rPr>
+        <w:t>Rates changed</w:t>
+      </w:r>
+      <w:r>
+        <w:rPr>
+          <w:rFonts w:ascii="Calibri" w:hAnsi="Calibri" w:eastAsia="Microsoft JhengHei"/>
+          <w:sz w:val="22"/>
+        </w:rPr>
+        <w:t xml:space="preserve"> → commit / push and purge jsDelivr CDN</w:t>
+      </w:r>
+    </w:p>
+    <w:p>
+      <w:pPr>
+        <w:pStyle w:val="ListNumber"/>
+      </w:pPr>
+      <w:r>
+        <w:rPr>
+          <w:rFonts w:ascii="Calibri" w:hAnsi="Calibri" w:eastAsia="Microsoft JhengHei"/>
+          <w:b/>
+          <w:sz w:val="22"/>
+        </w:rPr>
+        <w:t>Rates unchanged</w:t>
+      </w:r>
+      <w:r>
+        <w:rPr>
+          <w:rFonts w:ascii="Calibri" w:hAnsi="Calibri" w:eastAsia="Microsoft JhengHei"/>
+          <w:sz w:val="22"/>
+        </w:rPr>
+        <w:t xml:space="preserve"> → workflow still succeeds but </w:t>
+      </w:r>
+      <w:r>
+        <w:rPr>
+          <w:rFonts w:ascii="Calibri" w:hAnsi="Calibri" w:eastAsia="Microsoft JhengHei"/>
+          <w:b/>
+          <w:sz w:val="22"/>
+        </w:rPr>
+        <w:t>no new commit</w:t>
+      </w:r>
+      <w:r>
+        <w:rPr>
+          <w:rFonts w:ascii="Calibri" w:hAnsi="Calibri" w:eastAsia="Microsoft JhengHei"/>
+          <w:sz w:val="22"/>
+        </w:rPr>
+        <w:t xml:space="preserve"> (expected)</w:t>
+      </w:r>
+    </w:p>
+    <w:p>
+      <w:r>
+        <w:rPr>
+          <w:rFonts w:ascii="Calibri" w:hAnsi="Calibri" w:eastAsia="Microsoft JhengHei"/>
+          <w:sz w:val="22"/>
+        </w:rPr>
+        <w:t xml:space="preserve">Check </w:t>
+      </w:r>
+      <w:r>
+        <w:rPr>
+          <w:rFonts w:ascii="Consolas" w:hAnsi="Consolas" w:eastAsia="Consolas"/>
+          <w:color w:val="333333"/>
+          <w:sz w:val="22"/>
+        </w:rPr>
+        <w:t>changed=true/false</w:t>
+      </w:r>
+      <w:r>
+        <w:rPr>
+          <w:rFonts w:ascii="Calibri" w:hAnsi="Calibri" w:eastAsia="Microsoft JhengHei"/>
+          <w:sz w:val="22"/>
+        </w:rPr>
+        <w:t xml:space="preserve"> in logs, or whether </w:t>
+      </w:r>
+      <w:r>
+        <w:rPr>
+          <w:rFonts w:ascii="Consolas" w:hAnsi="Consolas" w:eastAsia="Consolas"/>
+          <w:color w:val="333333"/>
+          <w:sz w:val="22"/>
+        </w:rPr>
+        <w:t>fetchedAtUtc</w:t>
+      </w:r>
+      <w:r>
+        <w:rPr>
+          <w:rFonts w:ascii="Calibri" w:hAnsi="Calibri" w:eastAsia="Microsoft JhengHei"/>
+          <w:sz w:val="22"/>
+        </w:rPr>
+        <w:t xml:space="preserve"> refreshed in JSON.</w:t>
+      </w:r>
+    </w:p>
+    <w:p>
+      <w:pPr>
+        <w:pBdr>
+          <w:bottom w:val="single" w:sz="6" w:space="1" w:color="AAAAAA"/>
+        </w:pBdr>
+      </w:pPr>
+    </w:p>
+    <w:p>
+      <w:pPr>
+        <w:pStyle w:val="Heading2"/>
+      </w:pPr>
+      <w:r>
+        <w:rPr>
+          <w:rFonts w:ascii="Calibri" w:hAnsi="Calibri" w:eastAsia="Microsoft JhengHei"/>
+          <w:b/>
+          <w:sz w:val="28"/>
+        </w:rPr>
+        <w:t>0.2 Schedule not running? (step-by-step)</w:t>
+      </w:r>
+    </w:p>
+    <w:p>
+      <w:pPr>
+        <w:pStyle w:val="Heading3"/>
+      </w:pPr>
+      <w:r>
+        <w:rPr>
+          <w:rFonts w:ascii="Calibri" w:hAnsi="Calibri" w:eastAsia="Microsoft JhengHei"/>
+          <w:b/>
+          <w:sz w:val="24"/>
+        </w:rPr>
+        <w:t>Step 1: GitHub Actions</w:t>
+      </w:r>
+    </w:p>
+    <w:p>
+      <w:r>
+        <w:rPr>
+          <w:rFonts w:ascii="Calibri" w:hAnsi="Calibri" w:eastAsia="Microsoft JhengHei"/>
+          <w:sz w:val="22"/>
+        </w:rPr>
+        <w:t xml:space="preserve">Open </w:t>
+      </w:r>
+      <w:r>
+        <w:rPr>
+          <w:rFonts w:ascii="Calibri" w:hAnsi="Calibri" w:eastAsia="Microsoft JhengHei"/>
+          <w:color w:val="0563C1"/>
+          <w:sz w:val="22"/>
+        </w:rPr>
+        <w:t>Actions (https://github.com/ChesleyLo/DownloadBankOfTaiwanExchangeRate/actions)</w:t>
+      </w:r>
+      <w:r>
+        <w:rPr>
+          <w:rFonts w:ascii="Calibri" w:hAnsi="Calibri" w:eastAsia="Microsoft JhengHei"/>
+          <w:sz w:val="22"/>
+        </w:rPr>
+        <w:t>.</w:t>
+      </w:r>
+    </w:p>
+    <w:tbl>
+      <w:tblPr>
+        <w:tblStyle w:val="TableGrid"/>
+        <w:tblW w:type="auto" w:w="0"/>
+        <w:tblLook w:firstColumn="1" w:firstRow="1" w:lastColumn="0" w:lastRow="0" w:noHBand="0" w:noVBand="1" w:val="04A0"/>
+      </w:tblPr>
+      <w:tblGrid>
+        <w:gridCol w:w="4824"/>
+        <w:gridCol w:w="4824"/>
+      </w:tblGrid>
+      <w:tr>
+        <w:tc>
+          <w:tcPr>
+            <w:tcW w:type="dxa" w:w="4824"/>
+          </w:tcPr>
+          <w:p>
+            <w:r/>
+            <w:r>
+              <w:rPr>
+                <w:rFonts w:ascii="Calibri" w:hAnsi="Calibri" w:eastAsia="Microsoft JhengHei"/>
+                <w:b/>
+                <w:sz w:val="20"/>
+              </w:rPr>
+              <w:t>Observation</w:t>
+            </w:r>
+          </w:p>
+        </w:tc>
+        <w:tc>
+          <w:tcPr>
+            <w:tcW w:type="dxa" w:w="4824"/>
+          </w:tcPr>
+          <w:p>
+            <w:r/>
+            <w:r>
+              <w:rPr>
+                <w:rFonts w:ascii="Calibri" w:hAnsi="Calibri" w:eastAsia="Microsoft JhengHei"/>
+                <w:b/>
+                <w:sz w:val="20"/>
+              </w:rPr>
+              <w:t>Meaning</w:t>
+            </w:r>
+          </w:p>
+        </w:tc>
+      </w:tr>
+      <w:tr>
+        <w:tc>
+          <w:tcPr>
+            <w:tcW w:type="dxa" w:w="4824"/>
+          </w:tcPr>
+          <w:p>
+            <w:r/>
+            <w:r>
+              <w:rPr>
+                <w:rFonts w:ascii="Calibri" w:hAnsi="Calibri" w:eastAsia="Microsoft JhengHei"/>
+                <w:sz w:val="20"/>
+              </w:rPr>
+              <w:t>workflow_dispatch + success</w:t>
+            </w:r>
+          </w:p>
+        </w:tc>
+        <w:tc>
+          <w:tcPr>
+            <w:tcW w:type="dxa" w:w="4824"/>
+          </w:tcPr>
+          <w:p>
+            <w:r/>
+            <w:r>
+              <w:rPr>
+                <w:rFonts w:ascii="Calibri" w:hAnsi="Calibri" w:eastAsia="Microsoft JhengHei"/>
+                <w:sz w:val="20"/>
+              </w:rPr>
+              <w:t>Trigger works</w:t>
+            </w:r>
+          </w:p>
+        </w:tc>
+      </w:tr>
+      <w:tr>
+        <w:tc>
+          <w:tcPr>
+            <w:tcW w:type="dxa" w:w="4824"/>
+          </w:tcPr>
+          <w:p>
+            <w:r/>
+            <w:r>
+              <w:rPr>
+                <w:rFonts w:ascii="Calibri" w:hAnsi="Calibri" w:eastAsia="Microsoft JhengHei"/>
+                <w:sz w:val="20"/>
+              </w:rPr>
+              <w:t>No new runs</w:t>
+            </w:r>
+          </w:p>
+        </w:tc>
+        <w:tc>
+          <w:tcPr>
+            <w:tcW w:type="dxa" w:w="4824"/>
+          </w:tcPr>
+          <w:p>
+            <w:r/>
+            <w:r>
+              <w:rPr>
+                <w:rFonts w:ascii="Calibri" w:hAnsi="Calibri" w:eastAsia="Microsoft JhengHei"/>
+                <w:sz w:val="20"/>
+              </w:rPr>
+              <w:t>continue to Step 2</w:t>
+            </w:r>
+          </w:p>
+        </w:tc>
+      </w:tr>
+      <w:tr>
+        <w:tc>
+          <w:tcPr>
+            <w:tcW w:type="dxa" w:w="4824"/>
+          </w:tcPr>
+          <w:p>
+            <w:r/>
+            <w:r>
+              <w:rPr>
+                <w:rFonts w:ascii="Calibri" w:hAnsi="Calibri" w:eastAsia="Microsoft JhengHei"/>
+                <w:sz w:val="20"/>
+              </w:rPr>
+              <w:t>Runs but failure</w:t>
+            </w:r>
+          </w:p>
+        </w:tc>
+        <w:tc>
+          <w:tcPr>
+            <w:tcW w:type="dxa" w:w="4824"/>
+          </w:tcPr>
+          <w:p>
+            <w:r/>
+            <w:r>
+              <w:rPr>
+                <w:rFonts w:ascii="Calibri" w:hAnsi="Calibri" w:eastAsia="Microsoft JhengHei"/>
+                <w:sz w:val="20"/>
+              </w:rPr>
+              <w:t>inspect download/commit logs</w:t>
+            </w:r>
+          </w:p>
+        </w:tc>
+      </w:tr>
+    </w:tbl>
+    <w:p/>
+    <w:p>
+      <w:pPr>
+        <w:pStyle w:val="Heading3"/>
+      </w:pPr>
+      <w:r>
+        <w:rPr>
+          <w:rFonts w:ascii="Calibri" w:hAnsi="Calibri" w:eastAsia="Microsoft JhengHei"/>
+          <w:b/>
+          <w:sz w:val="24"/>
+        </w:rPr>
+        <w:t>Step 2: cron-job.org</w:t>
+      </w:r>
+    </w:p>
+    <w:p>
+      <w:r>
+        <w:rPr>
+          <w:rFonts w:ascii="Calibri" w:hAnsi="Calibri" w:eastAsia="Microsoft JhengHei"/>
+          <w:sz w:val="22"/>
+        </w:rPr>
+        <w:t xml:space="preserve">Open </w:t>
+      </w:r>
+      <w:r>
+        <w:rPr>
+          <w:rFonts w:ascii="Calibri" w:hAnsi="Calibri" w:eastAsia="Microsoft JhengHei"/>
+          <w:color w:val="0563C1"/>
+          <w:sz w:val="22"/>
+        </w:rPr>
+        <w:t>Jobs (https://console.cron-job.org/jobs)</w:t>
+      </w:r>
+      <w:r>
+        <w:rPr>
+          <w:rFonts w:ascii="Calibri" w:hAnsi="Calibri" w:eastAsia="Microsoft JhengHei"/>
+          <w:sz w:val="22"/>
+        </w:rPr>
+        <w:t xml:space="preserve"> → </w:t>
+      </w:r>
+      <w:r>
+        <w:rPr>
+          <w:rFonts w:ascii="Consolas" w:hAnsi="Consolas" w:eastAsia="Consolas"/>
+          <w:color w:val="333333"/>
+          <w:sz w:val="22"/>
+        </w:rPr>
+        <w:t>BOT FX Rates</w:t>
+      </w:r>
+      <w:r>
+        <w:rPr>
+          <w:rFonts w:ascii="Calibri" w:hAnsi="Calibri" w:eastAsia="Microsoft JhengHei"/>
+          <w:sz w:val="22"/>
+        </w:rPr>
+        <w:t xml:space="preserve"> → </w:t>
+      </w:r>
+      <w:r>
+        <w:rPr>
+          <w:rFonts w:ascii="Calibri" w:hAnsi="Calibri" w:eastAsia="Microsoft JhengHei"/>
+          <w:b/>
+          <w:sz w:val="22"/>
+        </w:rPr>
+        <w:t>History</w:t>
+      </w:r>
+      <w:r>
+        <w:rPr>
+          <w:rFonts w:ascii="Calibri" w:hAnsi="Calibri" w:eastAsia="Microsoft JhengHei"/>
+          <w:sz w:val="22"/>
+        </w:rPr>
+        <w:t>.</w:t>
+      </w:r>
+    </w:p>
+    <w:tbl>
+      <w:tblPr>
+        <w:tblStyle w:val="TableGrid"/>
+        <w:tblW w:type="auto" w:w="0"/>
+        <w:tblLook w:firstColumn="1" w:firstRow="1" w:lastColumn="0" w:lastRow="0" w:noHBand="0" w:noVBand="1" w:val="04A0"/>
+      </w:tblPr>
+      <w:tblGrid>
+        <w:gridCol w:w="4824"/>
+        <w:gridCol w:w="4824"/>
+      </w:tblGrid>
+      <w:tr>
+        <w:tc>
+          <w:tcPr>
+            <w:tcW w:type="dxa" w:w="4824"/>
+          </w:tcPr>
+          <w:p>
+            <w:r/>
+            <w:r>
+              <w:rPr>
+                <w:rFonts w:ascii="Calibri" w:hAnsi="Calibri" w:eastAsia="Microsoft JhengHei"/>
+                <w:b/>
+                <w:sz w:val="20"/>
+              </w:rPr>
+              <w:t>HTTP</w:t>
+            </w:r>
+          </w:p>
+        </w:tc>
+        <w:tc>
+          <w:tcPr>
+            <w:tcW w:type="dxa" w:w="4824"/>
+          </w:tcPr>
+          <w:p>
+            <w:r/>
+            <w:r>
+              <w:rPr>
+                <w:rFonts w:ascii="Calibri" w:hAnsi="Calibri" w:eastAsia="Microsoft JhengHei"/>
+                <w:b/>
+                <w:sz w:val="20"/>
+              </w:rPr>
+              <w:t>Meaning</w:t>
+            </w:r>
+          </w:p>
+        </w:tc>
+      </w:tr>
+      <w:tr>
+        <w:tc>
+          <w:tcPr>
+            <w:tcW w:type="dxa" w:w="4824"/>
+          </w:tcPr>
+          <w:p>
+            <w:r/>
+            <w:r>
+              <w:rPr>
+                <w:rFonts w:ascii="Calibri" w:hAnsi="Calibri" w:eastAsia="Microsoft JhengHei"/>
+                <w:sz w:val="20"/>
+              </w:rPr>
+              <w:t>204</w:t>
+            </w:r>
+          </w:p>
+        </w:tc>
+        <w:tc>
+          <w:tcPr>
+            <w:tcW w:type="dxa" w:w="4824"/>
+          </w:tcPr>
+          <w:p>
+            <w:r/>
+            <w:r>
+              <w:rPr>
+                <w:rFonts w:ascii="Calibri" w:hAnsi="Calibri" w:eastAsia="Microsoft JhengHei"/>
+                <w:sz w:val="20"/>
+              </w:rPr>
+              <w:t>dispatch OK</w:t>
+            </w:r>
+          </w:p>
+        </w:tc>
+      </w:tr>
+      <w:tr>
+        <w:tc>
+          <w:tcPr>
+            <w:tcW w:type="dxa" w:w="4824"/>
+          </w:tcPr>
+          <w:p>
+            <w:r/>
+            <w:r>
+              <w:rPr>
+                <w:rFonts w:ascii="Calibri" w:hAnsi="Calibri" w:eastAsia="Microsoft JhengHei"/>
+                <w:sz w:val="20"/>
+              </w:rPr>
+              <w:t>401 / 403</w:t>
+            </w:r>
+          </w:p>
+        </w:tc>
+        <w:tc>
+          <w:tcPr>
+            <w:tcW w:type="dxa" w:w="4824"/>
+          </w:tcPr>
+          <w:p>
+            <w:r/>
+            <w:r>
+              <w:rPr>
+                <w:rFonts w:ascii="Calibri" w:hAnsi="Calibri" w:eastAsia="Microsoft JhengHei"/>
+                <w:sz w:val="20"/>
+              </w:rPr>
+              <w:t>GitHub token expired or missing Actions: write → rerun setup_cron_job.py</w:t>
+            </w:r>
+          </w:p>
+        </w:tc>
+      </w:tr>
+      <w:tr>
+        <w:tc>
+          <w:tcPr>
+            <w:tcW w:type="dxa" w:w="4824"/>
+          </w:tcPr>
+          <w:p>
+            <w:r/>
+            <w:r>
+              <w:rPr>
+                <w:rFonts w:ascii="Calibri" w:hAnsi="Calibri" w:eastAsia="Microsoft JhengHei"/>
+                <w:sz w:val="20"/>
+              </w:rPr>
+              <w:t>404</w:t>
+            </w:r>
+          </w:p>
+        </w:tc>
+        <w:tc>
+          <w:tcPr>
+            <w:tcW w:type="dxa" w:w="4824"/>
+          </w:tcPr>
+          <w:p>
+            <w:r/>
+            <w:r>
+              <w:rPr>
+                <w:rFonts w:ascii="Calibri" w:hAnsi="Calibri" w:eastAsia="Microsoft JhengHei"/>
+                <w:sz w:val="20"/>
+              </w:rPr>
+              <w:t>wrong workflow URL</w:t>
+            </w:r>
+          </w:p>
+        </w:tc>
+      </w:tr>
+      <w:tr>
+        <w:tc>
+          <w:tcPr>
+            <w:tcW w:type="dxa" w:w="4824"/>
+          </w:tcPr>
+          <w:p>
+            <w:r/>
+            <w:r>
+              <w:rPr>
+                <w:rFonts w:ascii="Calibri" w:hAnsi="Calibri" w:eastAsia="Microsoft JhengHei"/>
+                <w:sz w:val="20"/>
+              </w:rPr>
+              <w:t>No history</w:t>
+            </w:r>
+          </w:p>
+        </w:tc>
+        <w:tc>
+          <w:tcPr>
+            <w:tcW w:type="dxa" w:w="4824"/>
+          </w:tcPr>
+          <w:p>
+            <w:r/>
+            <w:r>
+              <w:rPr>
+                <w:rFonts w:ascii="Calibri" w:hAnsi="Calibri" w:eastAsia="Microsoft JhengHei"/>
+                <w:sz w:val="20"/>
+              </w:rPr>
+              <w:t>job disabled or not yet due</w:t>
+            </w:r>
+          </w:p>
+        </w:tc>
+      </w:tr>
+    </w:tbl>
+    <w:p/>
+    <w:p>
+      <w:r>
+        <w:rPr>
+          <w:rFonts w:ascii="Calibri" w:hAnsi="Calibri" w:eastAsia="Microsoft JhengHei"/>
+          <w:sz w:val="22"/>
+        </w:rPr>
+        <w:t>Recreate jobs:</w:t>
+      </w:r>
+    </w:p>
+    <w:p>
+      <w:pPr>
+        <w:spacing w:before="120" w:after="120"/>
+        <w:ind w:left="288"/>
+        <w:shd w:fill="F5F5F5" w:val="clear"/>
+      </w:pPr>
+      <w:r>
+        <w:rPr>
+          <w:rFonts w:ascii="Consolas" w:hAnsi="Consolas" w:eastAsia="Consolas"/>
+          <w:sz w:val="18"/>
+        </w:rPr>
+        <w:t>export CRONJOB_API_KEY="your_api_key"</w:t>
+        <w:br/>
+        <w:t>python3 scripts/setup_cron_job.py</w:t>
+      </w:r>
+    </w:p>
+    <w:p>
+      <w:pPr>
+        <w:pStyle w:val="Heading3"/>
+      </w:pPr>
+      <w:r>
+        <w:rPr>
+          <w:rFonts w:ascii="Calibri" w:hAnsi="Calibri" w:eastAsia="Microsoft JhengHei"/>
+          <w:b/>
+          <w:sz w:val="24"/>
+        </w:rPr>
+        <w:t>Step 3: Manual trigger (fastest test)</w:t>
+      </w:r>
+    </w:p>
+    <w:p>
+      <w:pPr>
+        <w:spacing w:before="120" w:after="120"/>
+        <w:ind w:left="288"/>
+        <w:shd w:fill="F5F5F5" w:val="clear"/>
+      </w:pPr>
+      <w:r>
+        <w:rPr>
+          <w:rFonts w:ascii="Consolas" w:hAnsi="Consolas" w:eastAsia="Consolas"/>
+          <w:sz w:val="18"/>
+        </w:rPr>
+        <w:t>./scripts/trigger_update.sh</w:t>
+      </w:r>
+    </w:p>
+    <w:p>
+      <w:r>
+        <w:rPr>
+          <w:rFonts w:ascii="Calibri" w:hAnsi="Calibri" w:eastAsia="Microsoft JhengHei"/>
+          <w:sz w:val="22"/>
+        </w:rPr>
+        <w:t xml:space="preserve">Or Actions → </w:t>
+      </w:r>
+      <w:r>
+        <w:rPr>
+          <w:rFonts w:ascii="Calibri" w:hAnsi="Calibri" w:eastAsia="Microsoft JhengHei"/>
+          <w:b/>
+          <w:sz w:val="22"/>
+        </w:rPr>
+        <w:t>Update BOT FX Rates</w:t>
+      </w:r>
+      <w:r>
+        <w:rPr>
+          <w:rFonts w:ascii="Calibri" w:hAnsi="Calibri" w:eastAsia="Microsoft JhengHei"/>
+          <w:sz w:val="22"/>
+        </w:rPr>
+        <w:t xml:space="preserve"> → </w:t>
+      </w:r>
+      <w:r>
+        <w:rPr>
+          <w:rFonts w:ascii="Calibri" w:hAnsi="Calibri" w:eastAsia="Microsoft JhengHei"/>
+          <w:b/>
+          <w:sz w:val="22"/>
+        </w:rPr>
+        <w:t>Run workflow</w:t>
+      </w:r>
+      <w:r>
+        <w:rPr>
+          <w:rFonts w:ascii="Calibri" w:hAnsi="Calibri" w:eastAsia="Microsoft JhengHei"/>
+          <w:sz w:val="22"/>
+        </w:rPr>
+        <w:t>.</w:t>
+      </w:r>
+    </w:p>
+    <w:p>
+      <w:r>
+        <w:rPr>
+          <w:rFonts w:ascii="Calibri" w:hAnsi="Calibri" w:eastAsia="Microsoft JhengHei"/>
+          <w:sz w:val="22"/>
+        </w:rPr>
+        <w:t>Manual OK + auto fails → cron-job.org or token issue, not the download script.</w:t>
+      </w:r>
+    </w:p>
+    <w:p>
+      <w:pPr>
+        <w:pStyle w:val="Heading3"/>
+      </w:pPr>
+      <w:r>
+        <w:rPr>
+          <w:rFonts w:ascii="Calibri" w:hAnsi="Calibri" w:eastAsia="Microsoft JhengHei"/>
+          <w:b/>
+          <w:sz w:val="24"/>
+        </w:rPr>
+        <w:t>Step 4: Local Mac fallback (optional)</w:t>
+      </w:r>
+    </w:p>
+    <w:p>
+      <w:pPr>
+        <w:spacing w:before="120" w:after="120"/>
+        <w:ind w:left="288"/>
+        <w:shd w:fill="F5F5F5" w:val="clear"/>
+      </w:pPr>
+      <w:r>
+        <w:rPr>
+          <w:rFonts w:ascii="Consolas" w:hAnsi="Consolas" w:eastAsia="Consolas"/>
+          <w:sz w:val="18"/>
+        </w:rPr>
+        <w:t>./scripts/install_launchd.sh</w:t>
+      </w:r>
+    </w:p>
+    <w:p>
+      <w:r>
+        <w:rPr>
+          <w:rFonts w:ascii="Calibri" w:hAnsi="Calibri" w:eastAsia="Microsoft JhengHei"/>
+          <w:sz w:val="22"/>
+        </w:rPr>
+        <w:t xml:space="preserve">Logs: </w:t>
+      </w:r>
+      <w:r>
+        <w:rPr>
+          <w:rFonts w:ascii="Consolas" w:hAnsi="Consolas" w:eastAsia="Consolas"/>
+          <w:color w:val="333333"/>
+          <w:sz w:val="22"/>
+        </w:rPr>
+        <w:t>/tmp/bot-fx-trigger.log</w:t>
+      </w:r>
+      <w:r>
+        <w:rPr>
+          <w:rFonts w:ascii="Calibri" w:hAnsi="Calibri" w:eastAsia="Microsoft JhengHei"/>
+          <w:sz w:val="22"/>
+        </w:rPr>
+        <w:t xml:space="preserve">, </w:t>
+      </w:r>
+      <w:r>
+        <w:rPr>
+          <w:rFonts w:ascii="Consolas" w:hAnsi="Consolas" w:eastAsia="Consolas"/>
+          <w:color w:val="333333"/>
+          <w:sz w:val="22"/>
+        </w:rPr>
+        <w:t>/tmp/bot-fx-trigger.stderr.log</w:t>
+      </w:r>
+    </w:p>
+    <w:p>
+      <w:pPr>
+        <w:pBdr>
+          <w:bottom w:val="single" w:sz="6" w:space="1" w:color="AAAAAA"/>
+        </w:pBdr>
+      </w:pPr>
+    </w:p>
+    <w:p>
+      <w:pPr>
+        <w:pStyle w:val="Heading2"/>
+      </w:pPr>
+      <w:r>
+        <w:rPr>
+          <w:rFonts w:ascii="Calibri" w:hAnsi="Calibri" w:eastAsia="Microsoft JhengHei"/>
+          <w:b/>
+          <w:sz w:val="28"/>
+        </w:rPr>
+        <w:t>0.3 Common misconceptions</w:t>
+      </w:r>
+    </w:p>
+    <w:tbl>
+      <w:tblPr>
+        <w:tblStyle w:val="TableGrid"/>
+        <w:tblW w:type="auto" w:w="0"/>
+        <w:tblLook w:firstColumn="1" w:firstRow="1" w:lastColumn="0" w:lastRow="0" w:noHBand="0" w:noVBand="1" w:val="04A0"/>
+      </w:tblPr>
+      <w:tblGrid>
+        <w:gridCol w:w="4824"/>
+        <w:gridCol w:w="4824"/>
+      </w:tblGrid>
+      <w:tr>
+        <w:tc>
+          <w:tcPr>
+            <w:tcW w:type="dxa" w:w="4824"/>
+          </w:tcPr>
+          <w:p>
+            <w:r/>
+            <w:r>
+              <w:rPr>
+                <w:rFonts w:ascii="Calibri" w:hAnsi="Calibri" w:eastAsia="Microsoft JhengHei"/>
+                <w:b/>
+                <w:sz w:val="20"/>
+              </w:rPr>
+              <w:t>Symptom</w:t>
+            </w:r>
+          </w:p>
+        </w:tc>
+        <w:tc>
+          <w:tcPr>
+            <w:tcW w:type="dxa" w:w="4824"/>
+          </w:tcPr>
+          <w:p>
+            <w:r/>
+            <w:r>
+              <w:rPr>
+                <w:rFonts w:ascii="Calibri" w:hAnsi="Calibri" w:eastAsia="Microsoft JhengHei"/>
+                <w:b/>
+                <w:sz w:val="20"/>
+              </w:rPr>
+              <w:t>Reality</w:t>
+            </w:r>
+          </w:p>
+        </w:tc>
+      </w:tr>
+      <w:tr>
+        <w:tc>
+          <w:tcPr>
+            <w:tcW w:type="dxa" w:w="4824"/>
+          </w:tcPr>
+          <w:p>
+            <w:r/>
+            <w:r>
+              <w:rPr>
+                <w:rFonts w:ascii="Calibri" w:hAnsi="Calibri" w:eastAsia="Microsoft JhengHei"/>
+                <w:sz w:val="20"/>
+              </w:rPr>
+              <w:t>Actions ran, no new commit</w:t>
+            </w:r>
+          </w:p>
+        </w:tc>
+        <w:tc>
+          <w:tcPr>
+            <w:tcW w:type="dxa" w:w="4824"/>
+          </w:tcPr>
+          <w:p>
+            <w:r/>
+            <w:r>
+              <w:rPr>
+                <w:rFonts w:ascii="Calibri" w:hAnsi="Calibri" w:eastAsia="Microsoft JhengHei"/>
+                <w:sz w:val="20"/>
+              </w:rPr>
+              <w:t>rates unchanged (changed=false) — normal</w:t>
+            </w:r>
+          </w:p>
+        </w:tc>
+      </w:tr>
+      <w:tr>
+        <w:tc>
+          <w:tcPr>
+            <w:tcW w:type="dxa" w:w="4824"/>
+          </w:tcPr>
+          <w:p>
+            <w:r/>
+            <w:r>
+              <w:rPr>
+                <w:rFonts w:ascii="Calibri" w:hAnsi="Calibri" w:eastAsia="Microsoft JhengHei"/>
+                <w:sz w:val="20"/>
+              </w:rPr>
+              <w:t>CDN JSON looks the same</w:t>
+            </w:r>
+          </w:p>
+        </w:tc>
+        <w:tc>
+          <w:tcPr>
+            <w:tcW w:type="dxa" w:w="4824"/>
+          </w:tcPr>
+          <w:p>
+            <w:r/>
+            <w:r>
+              <w:rPr>
+                <w:rFonts w:ascii="Calibri" w:hAnsi="Calibri" w:eastAsia="Microsoft JhengHei"/>
+                <w:sz w:val="20"/>
+              </w:rPr>
+              <w:t>same reason; or jsDelivr cache — purge if needed</w:t>
+            </w:r>
+          </w:p>
+        </w:tc>
+      </w:tr>
+      <w:tr>
+        <w:tc>
+          <w:tcPr>
+            <w:tcW w:type="dxa" w:w="4824"/>
+          </w:tcPr>
+          <w:p>
+            <w:r/>
+            <w:r>
+              <w:rPr>
+                <w:rFonts w:ascii="Calibri" w:hAnsi="Calibri" w:eastAsia="Microsoft JhengHei"/>
+                <w:sz w:val="20"/>
+              </w:rPr>
+              <w:t>Nothing on weekends</w:t>
+            </w:r>
+          </w:p>
+        </w:tc>
+        <w:tc>
+          <w:tcPr>
+            <w:tcW w:type="dxa" w:w="4824"/>
+          </w:tcPr>
+          <w:p>
+            <w:r/>
+            <w:r>
+              <w:rPr>
+                <w:rFonts w:ascii="Calibri" w:hAnsi="Calibri" w:eastAsia="Microsoft JhengHei"/>
+                <w:sz w:val="20"/>
+              </w:rPr>
+              <w:t>by design (weekdays only)</w:t>
+            </w:r>
+          </w:p>
+        </w:tc>
+      </w:tr>
+      <w:tr>
+        <w:tc>
+          <w:tcPr>
+            <w:tcW w:type="dxa" w:w="4824"/>
+          </w:tcPr>
+          <w:p>
+            <w:r/>
+            <w:r>
+              <w:rPr>
+                <w:rFonts w:ascii="Calibri" w:hAnsi="Calibri" w:eastAsia="Microsoft JhengHei"/>
+                <w:sz w:val="20"/>
+              </w:rPr>
+              <w:t>GitHub schedule skipped</w:t>
+            </w:r>
+          </w:p>
+        </w:tc>
+        <w:tc>
+          <w:tcPr>
+            <w:tcW w:type="dxa" w:w="4824"/>
+          </w:tcPr>
+          <w:p>
+            <w:r/>
+            <w:r>
+              <w:rPr>
+                <w:rFonts w:ascii="Calibri" w:hAnsi="Calibri" w:eastAsia="Microsoft JhengHei"/>
+                <w:sz w:val="20"/>
+              </w:rPr>
+              <w:t>known issue; rely on cron-job.org</w:t>
+            </w:r>
+          </w:p>
+        </w:tc>
+      </w:tr>
+      <w:tr>
+        <w:tc>
+          <w:tcPr>
+            <w:tcW w:type="dxa" w:w="4824"/>
+          </w:tcPr>
+          <w:p>
+            <w:r/>
+            <w:r>
+              <w:rPr>
+                <w:rFonts w:ascii="Calibri" w:hAnsi="Calibri" w:eastAsia="Microsoft JhengHei"/>
+                <w:sz w:val="20"/>
+              </w:rPr>
+              <w:t>Public holidays still run</w:t>
+            </w:r>
+          </w:p>
+        </w:tc>
+        <w:tc>
+          <w:tcPr>
+            <w:tcW w:type="dxa" w:w="4824"/>
+          </w:tcPr>
+          <w:p>
+            <w:r/>
+            <w:r>
+              <w:rPr>
+                <w:rFonts w:ascii="Calibri" w:hAnsi="Calibri" w:eastAsia="Microsoft JhengHei"/>
+                <w:sz w:val="20"/>
+              </w:rPr>
+              <w:t>cron excludes weekends only, not TW holidays</w:t>
+            </w:r>
+          </w:p>
+        </w:tc>
+      </w:tr>
+    </w:tbl>
+    <w:p/>
+    <w:p>
+      <w:pPr>
+        <w:pBdr>
+          <w:bottom w:val="single" w:sz="6" w:space="1" w:color="AAAAAA"/>
+        </w:pBdr>
+      </w:pPr>
+    </w:p>
+    <w:p>
+      <w:pPr>
+        <w:pStyle w:val="Heading2"/>
+      </w:pPr>
+      <w:r>
+        <w:rPr>
+          <w:rFonts w:ascii="Calibri" w:hAnsi="Calibri" w:eastAsia="Microsoft JhengHei"/>
+          <w:b/>
+          <w:sz w:val="28"/>
+        </w:rPr>
+        <w:t>0.4 Recommended weekly checks</w:t>
+      </w:r>
+    </w:p>
+    <w:p>
+      <w:pPr>
+        <w:pStyle w:val="ListNumber"/>
+      </w:pPr>
+      <w:r>
+        <w:rPr>
+          <w:rFonts w:ascii="Calibri" w:hAnsi="Calibri" w:eastAsia="Microsoft JhengHei"/>
+          <w:sz w:val="22"/>
+        </w:rPr>
+        <w:t xml:space="preserve">cron-job.org History shows recent </w:t>
+      </w:r>
+      <w:r>
+        <w:rPr>
+          <w:rFonts w:ascii="Calibri" w:hAnsi="Calibri" w:eastAsia="Microsoft JhengHei"/>
+          <w:b/>
+          <w:sz w:val="22"/>
+        </w:rPr>
+        <w:t>204</w:t>
+      </w:r>
+      <w:r>
+        <w:rPr>
+          <w:rFonts w:ascii="Calibri" w:hAnsi="Calibri" w:eastAsia="Microsoft JhengHei"/>
+          <w:sz w:val="22"/>
+        </w:rPr>
+        <w:t xml:space="preserve"> responses</w:t>
+      </w:r>
+    </w:p>
+    <w:p>
+      <w:pPr>
+        <w:pStyle w:val="ListNumber"/>
+      </w:pPr>
+      <w:r>
+        <w:rPr>
+          <w:rFonts w:ascii="Calibri" w:hAnsi="Calibri" w:eastAsia="Microsoft JhengHei"/>
+          <w:sz w:val="22"/>
+        </w:rPr>
+        <w:t xml:space="preserve">GitHub Actions has successful weekday </w:t>
+      </w:r>
+      <w:r>
+        <w:rPr>
+          <w:rFonts w:ascii="Consolas" w:hAnsi="Consolas" w:eastAsia="Consolas"/>
+          <w:color w:val="333333"/>
+          <w:sz w:val="22"/>
+        </w:rPr>
+        <w:t>workflow_dispatch</w:t>
+      </w:r>
+      <w:r>
+        <w:rPr>
+          <w:rFonts w:ascii="Calibri" w:hAnsi="Calibri" w:eastAsia="Microsoft JhengHei"/>
+          <w:sz w:val="22"/>
+        </w:rPr>
+        <w:t xml:space="preserve"> runs</w:t>
+      </w:r>
+    </w:p>
+    <w:p>
+      <w:pPr>
+        <w:pStyle w:val="ListNumber"/>
+      </w:pPr>
+      <w:r>
+        <w:rPr>
+          <w:rFonts w:ascii="Calibri" w:hAnsi="Calibri" w:eastAsia="Microsoft JhengHei"/>
+          <w:sz w:val="22"/>
+        </w:rPr>
+        <w:t xml:space="preserve">CDN JSON </w:t>
+      </w:r>
+      <w:r>
+        <w:rPr>
+          <w:rFonts w:ascii="Consolas" w:hAnsi="Consolas" w:eastAsia="Consolas"/>
+          <w:color w:val="333333"/>
+          <w:sz w:val="22"/>
+        </w:rPr>
+        <w:t>fetchedAtUtc</w:t>
+      </w:r>
+      <w:r>
+        <w:rPr>
+          <w:rFonts w:ascii="Calibri" w:hAnsi="Calibri" w:eastAsia="Microsoft JhengHei"/>
+          <w:sz w:val="22"/>
+        </w:rPr>
+        <w:t xml:space="preserve"> is recent:</w:t>
+      </w:r>
+    </w:p>
+    <w:p>
+      <w:r>
+        <w:rPr>
+          <w:rFonts w:ascii="Calibri" w:hAnsi="Calibri" w:eastAsia="Microsoft JhengHei"/>
+          <w:sz w:val="22"/>
+        </w:rPr>
+        <w:t>https://cdn.jsdelivr.net/gh/ChesleyLo/DownloadBankOfTaiwanExchangeRate@main/data/bot-xrt-latest.json</w:t>
       </w:r>
     </w:p>
     <w:p>
@@ -773,7 +2277,7 @@
           <w:b/>
           <w:sz w:val="24"/>
         </w:rPr>
-        <w:t>1.3 Suggested times (Taiwan)</w:t>
+        <w:t>1.4 Suggested times (Taiwan)</w:t>
       </w:r>
     </w:p>
     <w:p>
@@ -825,7 +2329,7 @@
           <w:b/>
           <w:sz w:val="24"/>
         </w:rPr>
-        <w:t>1.4 Success signals</w:t>
+        <w:t>1.5 Success signals</w:t>
       </w:r>
     </w:p>
     <w:p>
@@ -1298,7 +2802,7 @@
           <w:b/>
           <w:sz w:val="28"/>
         </w:rPr>
-        <w:t>5. Troubleshooting</w:t>
+        <w:t>5. Troubleshooting (quick reference)</w:t>
       </w:r>
     </w:p>
     <w:tbl>
@@ -1372,7 +2876,7 @@
                 <w:rFonts w:ascii="Calibri" w:hAnsi="Calibri" w:eastAsia="Microsoft JhengHei"/>
                 <w:sz w:val="20"/>
               </w:rPr>
-              <w:t>Token missing Actions: write, or expired</w:t>
+              <w:t>GitHub token expired or missing Actions: write; rerun setup_cron_job.py</w:t>
             </w:r>
           </w:p>
         </w:tc>
@@ -1404,7 +2908,7 @@
                 <w:rFonts w:ascii="Calibri" w:hAnsi="Calibri" w:eastAsia="Microsoft JhengHei"/>
                 <w:sz w:val="20"/>
               </w:rPr>
-              <w:t>Wrong workflow file name / repo path</w:t>
+              <w:t>wrong workflow file / repo path</w:t>
             </w:r>
           </w:p>
         </w:tc>
@@ -1436,7 +2940,7 @@
                 <w:rFonts w:ascii="Calibri" w:hAnsi="Calibri" w:eastAsia="Microsoft JhengHei"/>
                 <w:sz w:val="20"/>
               </w:rPr>
-              <w:t>Workflow disabled, or wrong ref</w:t>
+              <w:t>workflow disabled, or wrong ref in body</w:t>
             </w:r>
           </w:p>
         </w:tc>
@@ -1468,13 +2972,94 @@
                 <w:rFonts w:ascii="Calibri" w:hAnsi="Calibri" w:eastAsia="Microsoft JhengHei"/>
                 <w:sz w:val="20"/>
               </w:rPr>
-              <w:t>Rates unchanged (changed=false) — normal</w:t>
+              <w:t>rates unchanged (changed=false) — normal</w:t>
+            </w:r>
+          </w:p>
+        </w:tc>
+      </w:tr>
+      <w:tr>
+        <w:tc>
+          <w:tcPr>
+            <w:tcW w:type="dxa" w:w="4824"/>
+          </w:tcPr>
+          <w:p>
+            <w:r/>
+            <w:r>
+              <w:rPr>
+                <w:rFonts w:ascii="Calibri" w:hAnsi="Calibri" w:eastAsia="Microsoft JhengHei"/>
+                <w:sz w:val="20"/>
+              </w:rPr>
+              <w:t>No runs at all</w:t>
+            </w:r>
+          </w:p>
+        </w:tc>
+        <w:tc>
+          <w:tcPr>
+            <w:tcW w:type="dxa" w:w="4824"/>
+          </w:tcPr>
+          <w:p>
+            <w:r/>
+            <w:r>
+              <w:rPr>
+                <w:rFonts w:ascii="Calibri" w:hAnsi="Calibri" w:eastAsia="Microsoft JhengHei"/>
+                <w:sz w:val="20"/>
+              </w:rPr>
+              <w:t>follow §0.2 step-by-step</w:t>
+            </w:r>
+          </w:p>
+        </w:tc>
+      </w:tr>
+      <w:tr>
+        <w:tc>
+          <w:tcPr>
+            <w:tcW w:type="dxa" w:w="4824"/>
+          </w:tcPr>
+          <w:p>
+            <w:r/>
+            <w:r>
+              <w:rPr>
+                <w:rFonts w:ascii="Calibri" w:hAnsi="Calibri" w:eastAsia="Microsoft JhengHei"/>
+                <w:sz w:val="20"/>
+              </w:rPr>
+              <w:t>Stale CDN data</w:t>
+            </w:r>
+          </w:p>
+        </w:tc>
+        <w:tc>
+          <w:tcPr>
+            <w:tcW w:type="dxa" w:w="4824"/>
+          </w:tcPr>
+          <w:p>
+            <w:r/>
+            <w:r>
+              <w:rPr>
+                <w:rFonts w:ascii="Calibri" w:hAnsi="Calibri" w:eastAsia="Microsoft JhengHei"/>
+                <w:sz w:val="20"/>
+              </w:rPr>
+              <w:t>check recent commits; purge jsDelivr if needed</w:t>
             </w:r>
           </w:p>
         </w:tc>
       </w:tr>
     </w:tbl>
     <w:p/>
+    <w:p>
+      <w:r>
+        <w:rPr>
+          <w:rFonts w:ascii="Calibri" w:hAnsi="Calibri" w:eastAsia="Microsoft JhengHei"/>
+          <w:sz w:val="22"/>
+        </w:rPr>
+        <w:t xml:space="preserve">Full triage flow: </w:t>
+      </w:r>
+      <w:r>
+        <w:rPr>
+          <w:rFonts w:ascii="Calibri" w:hAnsi="Calibri" w:eastAsia="Microsoft JhengHei"/>
+          <w:b/>
+          <w:sz w:val="22"/>
+        </w:rPr>
+        <w:t>§0.2 Schedule not running?</w:t>
+      </w:r>
+    </w:p>
     <w:p>
       <w:pPr>
         <w:pBdr>

</xml_diff>

<commit_message>
docs: add day-to-day guide for confirming schedule runs
Document §0.5 checklist (Actions, cron-job.org, CDN, manual test) in SCHEDULING and USER_GUIDE, with regenerated Word/PDF exports.

Co-authored-by: Cursor <cursoragent@cursor.com>
</commit_message>
<xml_diff>
--- a/docs/word/SCHEDULING.en.docx
+++ b/docs/word/SCHEDULING.en.docx
@@ -1685,6 +1685,882 @@
           <w:b/>
           <w:sz w:val="28"/>
         </w:rPr>
+        <w:t>0.5 How to confirm the schedule ran (day-to-day)</w:t>
+      </w:r>
+    </w:p>
+    <w:p>
+      <w:r>
+        <w:rPr>
+          <w:rFonts w:ascii="Calibri" w:hAnsi="Calibri" w:eastAsia="Microsoft JhengHei"/>
+          <w:sz w:val="22"/>
+        </w:rPr>
+        <w:t xml:space="preserve">Check in this order, </w:t>
+      </w:r>
+      <w:r>
+        <w:rPr>
+          <w:rFonts w:ascii="Calibri" w:hAnsi="Calibri" w:eastAsia="Microsoft JhengHei"/>
+          <w:b/>
+          <w:sz w:val="22"/>
+        </w:rPr>
+        <w:t>fastest first</w:t>
+      </w:r>
+      <w:r>
+        <w:rPr>
+          <w:rFonts w:ascii="Calibri" w:hAnsi="Calibri" w:eastAsia="Microsoft JhengHei"/>
+          <w:sz w:val="22"/>
+        </w:rPr>
+        <w:t>:</w:t>
+      </w:r>
+    </w:p>
+    <w:p>
+      <w:pPr>
+        <w:pStyle w:val="Heading3"/>
+      </w:pPr>
+      <w:r>
+        <w:rPr>
+          <w:rFonts w:ascii="Calibri" w:hAnsi="Calibri" w:eastAsia="Microsoft JhengHei"/>
+          <w:b/>
+          <w:sz w:val="24"/>
+        </w:rPr>
+        <w:t>① GitHub Actions (~30 seconds, start here)</w:t>
+      </w:r>
+    </w:p>
+    <w:p>
+      <w:r>
+        <w:rPr>
+          <w:rFonts w:ascii="Calibri" w:hAnsi="Calibri" w:eastAsia="Microsoft JhengHei"/>
+          <w:sz w:val="22"/>
+        </w:rPr>
+        <w:t>Open: https://github.com/ChesleyLo/DownloadBankOfTaiwanExchangeRate/actions</w:t>
+      </w:r>
+    </w:p>
+    <w:p>
+      <w:r>
+        <w:rPr>
+          <w:rFonts w:ascii="Calibri" w:hAnsi="Calibri" w:eastAsia="Microsoft JhengHei"/>
+          <w:sz w:val="22"/>
+        </w:rPr>
+        <w:t xml:space="preserve">Find </w:t>
+      </w:r>
+      <w:r>
+        <w:rPr>
+          <w:rFonts w:ascii="Calibri" w:hAnsi="Calibri" w:eastAsia="Microsoft JhengHei"/>
+          <w:b/>
+          <w:sz w:val="22"/>
+        </w:rPr>
+        <w:t>Update BOT FX Rates</w:t>
+      </w:r>
+      <w:r>
+        <w:rPr>
+          <w:rFonts w:ascii="Calibri" w:hAnsi="Calibri" w:eastAsia="Microsoft JhengHei"/>
+          <w:sz w:val="22"/>
+        </w:rPr>
+        <w:t>:</w:t>
+      </w:r>
+    </w:p>
+    <w:tbl>
+      <w:tblPr>
+        <w:tblStyle w:val="TableGrid"/>
+        <w:tblW w:type="auto" w:w="0"/>
+        <w:tblLook w:firstColumn="1" w:firstRow="1" w:lastColumn="0" w:lastRow="0" w:noHBand="0" w:noVBand="1" w:val="04A0"/>
+      </w:tblPr>
+      <w:tblGrid>
+        <w:gridCol w:w="4824"/>
+        <w:gridCol w:w="4824"/>
+      </w:tblGrid>
+      <w:tr>
+        <w:tc>
+          <w:tcPr>
+            <w:tcW w:type="dxa" w:w="4824"/>
+          </w:tcPr>
+          <w:p>
+            <w:r/>
+            <w:r>
+              <w:rPr>
+                <w:rFonts w:ascii="Calibri" w:hAnsi="Calibri" w:eastAsia="Microsoft JhengHei"/>
+                <w:b/>
+                <w:sz w:val="20"/>
+              </w:rPr>
+              <w:t>What you see</w:t>
+            </w:r>
+          </w:p>
+        </w:tc>
+        <w:tc>
+          <w:tcPr>
+            <w:tcW w:type="dxa" w:w="4824"/>
+          </w:tcPr>
+          <w:p>
+            <w:r/>
+            <w:r>
+              <w:rPr>
+                <w:rFonts w:ascii="Calibri" w:hAnsi="Calibri" w:eastAsia="Microsoft JhengHei"/>
+                <w:b/>
+                <w:sz w:val="20"/>
+              </w:rPr>
+              <w:t>Meaning</w:t>
+            </w:r>
+          </w:p>
+        </w:tc>
+      </w:tr>
+      <w:tr>
+        <w:tc>
+          <w:tcPr>
+            <w:tcW w:type="dxa" w:w="4824"/>
+          </w:tcPr>
+          <w:p>
+            <w:r/>
+            <w:r>
+              <w:rPr>
+                <w:rFonts w:ascii="Calibri" w:hAnsi="Calibri" w:eastAsia="Microsoft JhengHei"/>
+                <w:sz w:val="20"/>
+              </w:rPr>
+              <w:t>New workflow_dispatch with green ✓</w:t>
+            </w:r>
+          </w:p>
+        </w:tc>
+        <w:tc>
+          <w:tcPr>
+            <w:tcW w:type="dxa" w:w="4824"/>
+          </w:tcPr>
+          <w:p>
+            <w:r/>
+            <w:r>
+              <w:rPr>
+                <w:rFonts w:ascii="Calibri" w:hAnsi="Calibri" w:eastAsia="Microsoft JhengHei"/>
+                <w:sz w:val="20"/>
+              </w:rPr>
+              <w:t>Schedule triggered; run succeeded</w:t>
+            </w:r>
+          </w:p>
+        </w:tc>
+      </w:tr>
+      <w:tr>
+        <w:tc>
+          <w:tcPr>
+            <w:tcW w:type="dxa" w:w="4824"/>
+          </w:tcPr>
+          <w:p>
+            <w:r/>
+            <w:r>
+              <w:rPr>
+                <w:rFonts w:ascii="Calibri" w:hAnsi="Calibri" w:eastAsia="Microsoft JhengHei"/>
+                <w:sz w:val="20"/>
+              </w:rPr>
+              <w:t>No new runs</w:t>
+            </w:r>
+          </w:p>
+        </w:tc>
+        <w:tc>
+          <w:tcPr>
+            <w:tcW w:type="dxa" w:w="4824"/>
+          </w:tcPr>
+          <w:p>
+            <w:r/>
+            <w:r>
+              <w:rPr>
+                <w:rFonts w:ascii="Calibri" w:hAnsi="Calibri" w:eastAsia="Microsoft JhengHei"/>
+                <w:sz w:val="20"/>
+              </w:rPr>
+              <w:t>Schedule may not have fired → go to ②</w:t>
+            </w:r>
+          </w:p>
+        </w:tc>
+      </w:tr>
+      <w:tr>
+        <w:tc>
+          <w:tcPr>
+            <w:tcW w:type="dxa" w:w="4824"/>
+          </w:tcPr>
+          <w:p>
+            <w:r/>
+            <w:r>
+              <w:rPr>
+                <w:rFonts w:ascii="Calibri" w:hAnsi="Calibri" w:eastAsia="Microsoft JhengHei"/>
+                <w:sz w:val="20"/>
+              </w:rPr>
+              <w:t>Run exists but red ✗</w:t>
+            </w:r>
+          </w:p>
+        </w:tc>
+        <w:tc>
+          <w:tcPr>
+            <w:tcW w:type="dxa" w:w="4824"/>
+          </w:tcPr>
+          <w:p>
+            <w:r/>
+            <w:r>
+              <w:rPr>
+                <w:rFonts w:ascii="Calibri" w:hAnsi="Calibri" w:eastAsia="Microsoft JhengHei"/>
+                <w:sz w:val="20"/>
+              </w:rPr>
+              <w:t>Triggered but failed → open logs</w:t>
+            </w:r>
+          </w:p>
+        </w:tc>
+      </w:tr>
+    </w:tbl>
+    <w:p/>
+    <w:p>
+      <w:pPr>
+        <w:pStyle w:val="Heading3"/>
+      </w:pPr>
+      <w:r>
+        <w:rPr>
+          <w:rFonts w:ascii="Calibri" w:hAnsi="Calibri" w:eastAsia="Microsoft JhengHei"/>
+          <w:b/>
+          <w:sz w:val="24"/>
+        </w:rPr>
+        <w:t>② cron-job.org (confirm external cron hit GitHub)</w:t>
+      </w:r>
+    </w:p>
+    <w:p>
+      <w:r>
+        <w:rPr>
+          <w:rFonts w:ascii="Calibri" w:hAnsi="Calibri" w:eastAsia="Microsoft JhengHei"/>
+          <w:sz w:val="22"/>
+        </w:rPr>
+        <w:t>Open: https://console.cron-job.org/jobs</w:t>
+      </w:r>
+    </w:p>
+    <w:p>
+      <w:r>
+        <w:rPr>
+          <w:rFonts w:ascii="Calibri" w:hAnsi="Calibri" w:eastAsia="Microsoft JhengHei"/>
+          <w:sz w:val="22"/>
+        </w:rPr>
+        <w:t xml:space="preserve">Open </w:t>
+      </w:r>
+      <w:r>
+        <w:rPr>
+          <w:rFonts w:ascii="Calibri" w:hAnsi="Calibri" w:eastAsia="Microsoft JhengHei"/>
+          <w:b/>
+          <w:sz w:val="22"/>
+        </w:rPr>
+        <w:t>BOT FX Rates - Business hours</w:t>
+      </w:r>
+      <w:r>
+        <w:rPr>
+          <w:rFonts w:ascii="Calibri" w:hAnsi="Calibri" w:eastAsia="Microsoft JhengHei"/>
+          <w:sz w:val="22"/>
+        </w:rPr>
+        <w:t xml:space="preserve"> or </w:t>
+      </w:r>
+      <w:r>
+        <w:rPr>
+          <w:rFonts w:ascii="Calibri" w:hAnsi="Calibri" w:eastAsia="Microsoft JhengHei"/>
+          <w:b/>
+          <w:sz w:val="22"/>
+        </w:rPr>
+        <w:t>Evening</w:t>
+      </w:r>
+      <w:r>
+        <w:rPr>
+          <w:rFonts w:ascii="Calibri" w:hAnsi="Calibri" w:eastAsia="Microsoft JhengHei"/>
+          <w:sz w:val="22"/>
+        </w:rPr>
+        <w:t xml:space="preserve"> → </w:t>
+      </w:r>
+      <w:r>
+        <w:rPr>
+          <w:rFonts w:ascii="Calibri" w:hAnsi="Calibri" w:eastAsia="Microsoft JhengHei"/>
+          <w:b/>
+          <w:sz w:val="22"/>
+        </w:rPr>
+        <w:t>History</w:t>
+      </w:r>
+      <w:r>
+        <w:rPr>
+          <w:rFonts w:ascii="Calibri" w:hAnsi="Calibri" w:eastAsia="Microsoft JhengHei"/>
+          <w:sz w:val="22"/>
+        </w:rPr>
+        <w:t>:</w:t>
+      </w:r>
+    </w:p>
+    <w:tbl>
+      <w:tblPr>
+        <w:tblStyle w:val="TableGrid"/>
+        <w:tblW w:type="auto" w:w="0"/>
+        <w:tblLook w:firstColumn="1" w:firstRow="1" w:lastColumn="0" w:lastRow="0" w:noHBand="0" w:noVBand="1" w:val="04A0"/>
+      </w:tblPr>
+      <w:tblGrid>
+        <w:gridCol w:w="4824"/>
+        <w:gridCol w:w="4824"/>
+      </w:tblGrid>
+      <w:tr>
+        <w:tc>
+          <w:tcPr>
+            <w:tcW w:type="dxa" w:w="4824"/>
+          </w:tcPr>
+          <w:p>
+            <w:r/>
+            <w:r>
+              <w:rPr>
+                <w:rFonts w:ascii="Calibri" w:hAnsi="Calibri" w:eastAsia="Microsoft JhengHei"/>
+                <w:b/>
+                <w:sz w:val="20"/>
+              </w:rPr>
+              <w:t>HTTP</w:t>
+            </w:r>
+          </w:p>
+        </w:tc>
+        <w:tc>
+          <w:tcPr>
+            <w:tcW w:type="dxa" w:w="4824"/>
+          </w:tcPr>
+          <w:p>
+            <w:r/>
+            <w:r>
+              <w:rPr>
+                <w:rFonts w:ascii="Calibri" w:hAnsi="Calibri" w:eastAsia="Microsoft JhengHei"/>
+                <w:b/>
+                <w:sz w:val="20"/>
+              </w:rPr>
+              <w:t>Meaning</w:t>
+            </w:r>
+          </w:p>
+        </w:tc>
+      </w:tr>
+      <w:tr>
+        <w:tc>
+          <w:tcPr>
+            <w:tcW w:type="dxa" w:w="4824"/>
+          </w:tcPr>
+          <w:p>
+            <w:r/>
+            <w:r>
+              <w:rPr>
+                <w:rFonts w:ascii="Calibri" w:hAnsi="Calibri" w:eastAsia="Microsoft JhengHei"/>
+                <w:sz w:val="20"/>
+              </w:rPr>
+              <w:t>204</w:t>
+            </w:r>
+          </w:p>
+        </w:tc>
+        <w:tc>
+          <w:tcPr>
+            <w:tcW w:type="dxa" w:w="4824"/>
+          </w:tcPr>
+          <w:p>
+            <w:r/>
+            <w:r>
+              <w:rPr>
+                <w:rFonts w:ascii="Calibri" w:hAnsi="Calibri" w:eastAsia="Microsoft JhengHei"/>
+                <w:sz w:val="20"/>
+              </w:rPr>
+              <w:t>Successfully dispatched GitHub workflow</w:t>
+            </w:r>
+          </w:p>
+        </w:tc>
+      </w:tr>
+      <w:tr>
+        <w:tc>
+          <w:tcPr>
+            <w:tcW w:type="dxa" w:w="4824"/>
+          </w:tcPr>
+          <w:p>
+            <w:r/>
+            <w:r>
+              <w:rPr>
+                <w:rFonts w:ascii="Calibri" w:hAnsi="Calibri" w:eastAsia="Microsoft JhengHei"/>
+                <w:sz w:val="20"/>
+              </w:rPr>
+              <w:t>401 / 403</w:t>
+            </w:r>
+          </w:p>
+        </w:tc>
+        <w:tc>
+          <w:tcPr>
+            <w:tcW w:type="dxa" w:w="4824"/>
+          </w:tcPr>
+          <w:p>
+            <w:r/>
+            <w:r>
+              <w:rPr>
+                <w:rFonts w:ascii="Calibri" w:hAnsi="Calibri" w:eastAsia="Microsoft JhengHei"/>
+                <w:sz w:val="20"/>
+              </w:rPr>
+              <w:t>GitHub token expired → rerun setup_cron_job.py</w:t>
+            </w:r>
+          </w:p>
+        </w:tc>
+      </w:tr>
+      <w:tr>
+        <w:tc>
+          <w:tcPr>
+            <w:tcW w:type="dxa" w:w="4824"/>
+          </w:tcPr>
+          <w:p>
+            <w:r/>
+            <w:r>
+              <w:rPr>
+                <w:rFonts w:ascii="Calibri" w:hAnsi="Calibri" w:eastAsia="Microsoft JhengHei"/>
+                <w:sz w:val="20"/>
+              </w:rPr>
+              <w:t>No entries</w:t>
+            </w:r>
+          </w:p>
+        </w:tc>
+        <w:tc>
+          <w:tcPr>
+            <w:tcW w:type="dxa" w:w="4824"/>
+          </w:tcPr>
+          <w:p>
+            <w:r/>
+            <w:r>
+              <w:rPr>
+                <w:rFonts w:ascii="Calibri" w:hAnsi="Calibri" w:eastAsia="Microsoft JhengHei"/>
+                <w:sz w:val="20"/>
+              </w:rPr>
+              <w:t>Job disabled, or not yet due</w:t>
+            </w:r>
+          </w:p>
+        </w:tc>
+      </w:tr>
+    </w:tbl>
+    <w:p/>
+    <w:p>
+      <w:pPr>
+        <w:pStyle w:val="Heading3"/>
+      </w:pPr>
+      <w:r>
+        <w:rPr>
+          <w:rFonts w:ascii="Calibri" w:hAnsi="Calibri" w:eastAsia="Microsoft JhengHei"/>
+          <w:b/>
+          <w:sz w:val="24"/>
+        </w:rPr>
+        <w:t>③ CDN JSON (check data timestamp)</w:t>
+      </w:r>
+    </w:p>
+    <w:p>
+      <w:r>
+        <w:rPr>
+          <w:rFonts w:ascii="Calibri" w:hAnsi="Calibri" w:eastAsia="Microsoft JhengHei"/>
+          <w:sz w:val="22"/>
+        </w:rPr>
+        <w:t>Open:</w:t>
+      </w:r>
+    </w:p>
+    <w:p>
+      <w:r>
+        <w:rPr>
+          <w:rFonts w:ascii="Calibri" w:hAnsi="Calibri" w:eastAsia="Microsoft JhengHei"/>
+          <w:sz w:val="22"/>
+        </w:rPr>
+        <w:t>https://cdn.jsdelivr.net/gh/ChesleyLo/DownloadBankOfTaiwanExchangeRate@main/data/bot-xrt-latest.json</w:t>
+      </w:r>
+    </w:p>
+    <w:p>
+      <w:r>
+        <w:rPr>
+          <w:rFonts w:ascii="Calibri" w:hAnsi="Calibri" w:eastAsia="Microsoft JhengHei"/>
+          <w:sz w:val="22"/>
+        </w:rPr>
+        <w:t xml:space="preserve">Check </w:t>
+      </w:r>
+      <w:r>
+        <w:rPr>
+          <w:rFonts w:ascii="Consolas" w:hAnsi="Consolas" w:eastAsia="Consolas"/>
+          <w:color w:val="333333"/>
+          <w:sz w:val="22"/>
+        </w:rPr>
+        <w:t>fetchedAtUtc</w:t>
+      </w:r>
+      <w:r>
+        <w:rPr>
+          <w:rFonts w:ascii="Calibri" w:hAnsi="Calibri" w:eastAsia="Microsoft JhengHei"/>
+          <w:sz w:val="22"/>
+        </w:rPr>
+        <w:t>:</w:t>
+      </w:r>
+    </w:p>
+    <w:p>
+      <w:pPr>
+        <w:pStyle w:val="ListBullet"/>
+      </w:pPr>
+      <w:r>
+        <w:rPr>
+          <w:rFonts w:ascii="Calibri" w:hAnsi="Calibri" w:eastAsia="Microsoft JhengHei"/>
+          <w:b/>
+          <w:sz w:val="22"/>
+        </w:rPr>
+        <w:t>Recent</w:t>
+      </w:r>
+      <w:r>
+        <w:rPr>
+          <w:rFonts w:ascii="Calibri" w:hAnsi="Calibri" w:eastAsia="Microsoft JhengHei"/>
+          <w:sz w:val="22"/>
+        </w:rPr>
+        <w:t xml:space="preserve"> → data was fetched</w:t>
+      </w:r>
+    </w:p>
+    <w:p>
+      <w:pPr>
+        <w:pStyle w:val="ListBullet"/>
+      </w:pPr>
+      <w:r>
+        <w:rPr>
+          <w:rFonts w:ascii="Calibri" w:hAnsi="Calibri" w:eastAsia="Microsoft JhengHei"/>
+          <w:b/>
+          <w:sz w:val="22"/>
+        </w:rPr>
+        <w:t>Stale</w:t>
+      </w:r>
+      <w:r>
+        <w:rPr>
+          <w:rFonts w:ascii="Calibri" w:hAnsi="Calibri" w:eastAsia="Microsoft JhengHei"/>
+          <w:sz w:val="22"/>
+        </w:rPr>
+        <w:t xml:space="preserve"> → may not have run, or rates unchanged with no commit (confirm with ①)</w:t>
+      </w:r>
+    </w:p>
+    <w:p>
+      <w:pPr>
+        <w:ind w:left="360"/>
+      </w:pPr>
+      <w:r>
+        <w:rPr>
+          <w:rFonts w:ascii="Consolas" w:hAnsi="Consolas" w:eastAsia="Consolas"/>
+          <w:i/>
+          <w:color w:val="333333"/>
+          <w:sz w:val="22"/>
+        </w:rPr>
+        <w:t>fetchedAtUtc</w:t>
+      </w:r>
+      <w:r>
+        <w:rPr>
+          <w:rFonts w:ascii="Calibri" w:hAnsi="Calibri" w:eastAsia="Microsoft JhengHei"/>
+          <w:sz w:val="22"/>
+        </w:rPr>
+        <w:t xml:space="preserve"> updates only when a </w:t>
+      </w:r>
+      <w:r>
+        <w:rPr>
+          <w:rFonts w:ascii="Calibri" w:hAnsi="Calibri" w:eastAsia="Microsoft JhengHei"/>
+          <w:b/>
+          <w:sz w:val="22"/>
+        </w:rPr>
+        <w:t>commit</w:t>
+      </w:r>
+      <w:r>
+        <w:rPr>
+          <w:rFonts w:ascii="Calibri" w:hAnsi="Calibri" w:eastAsia="Microsoft JhengHei"/>
+          <w:sz w:val="22"/>
+        </w:rPr>
+        <w:t xml:space="preserve"> is pushed. If Actions ran with </w:t>
+      </w:r>
+      <w:r>
+        <w:rPr>
+          <w:rFonts w:ascii="Consolas" w:hAnsi="Consolas" w:eastAsia="Consolas"/>
+          <w:color w:val="333333"/>
+          <w:sz w:val="22"/>
+        </w:rPr>
+        <w:t>changed=false</w:t>
+      </w:r>
+      <w:r>
+        <w:rPr>
+          <w:rFonts w:ascii="Calibri" w:hAnsi="Calibri" w:eastAsia="Microsoft JhengHei"/>
+          <w:sz w:val="22"/>
+        </w:rPr>
+        <w:t xml:space="preserve">, CDN time may stay old — </w:t>
+      </w:r>
+      <w:r>
+        <w:rPr>
+          <w:rFonts w:ascii="Calibri" w:hAnsi="Calibri" w:eastAsia="Microsoft JhengHei"/>
+          <w:b/>
+          <w:sz w:val="22"/>
+        </w:rPr>
+        <w:t>that is normal</w:t>
+      </w:r>
+      <w:r>
+        <w:rPr>
+          <w:rFonts w:ascii="Calibri" w:hAnsi="Calibri" w:eastAsia="Microsoft JhengHei"/>
+          <w:sz w:val="22"/>
+        </w:rPr>
+        <w:t>.</w:t>
+      </w:r>
+    </w:p>
+    <w:p>
+      <w:pPr>
+        <w:pStyle w:val="Heading3"/>
+      </w:pPr>
+      <w:r>
+        <w:rPr>
+          <w:rFonts w:ascii="Calibri" w:hAnsi="Calibri" w:eastAsia="Microsoft JhengHei"/>
+          <w:b/>
+          <w:sz w:val="24"/>
+        </w:rPr>
+        <w:t>④ Manual test (when in doubt)</w:t>
+      </w:r>
+    </w:p>
+    <w:p>
+      <w:pPr>
+        <w:spacing w:before="120" w:after="120"/>
+        <w:ind w:left="288"/>
+        <w:shd w:fill="F5F5F5" w:val="clear"/>
+      </w:pPr>
+      <w:r>
+        <w:rPr>
+          <w:rFonts w:ascii="Consolas" w:hAnsi="Consolas" w:eastAsia="Consolas"/>
+          <w:sz w:val="18"/>
+        </w:rPr>
+        <w:t>./scripts/trigger_update.sh</w:t>
+      </w:r>
+    </w:p>
+    <w:p>
+      <w:r>
+        <w:rPr>
+          <w:rFonts w:ascii="Calibri" w:hAnsi="Calibri" w:eastAsia="Microsoft JhengHei"/>
+          <w:sz w:val="22"/>
+        </w:rPr>
+        <w:t xml:space="preserve">Or Actions → </w:t>
+      </w:r>
+      <w:r>
+        <w:rPr>
+          <w:rFonts w:ascii="Calibri" w:hAnsi="Calibri" w:eastAsia="Microsoft JhengHei"/>
+          <w:b/>
+          <w:sz w:val="22"/>
+        </w:rPr>
+        <w:t>Run workflow</w:t>
+      </w:r>
+    </w:p>
+    <w:tbl>
+      <w:tblPr>
+        <w:tblStyle w:val="TableGrid"/>
+        <w:tblW w:type="auto" w:w="0"/>
+        <w:tblLook w:firstColumn="1" w:firstRow="1" w:lastColumn="0" w:lastRow="0" w:noHBand="0" w:noVBand="1" w:val="04A0"/>
+      </w:tblPr>
+      <w:tblGrid>
+        <w:gridCol w:w="4824"/>
+        <w:gridCol w:w="4824"/>
+      </w:tblGrid>
+      <w:tr>
+        <w:tc>
+          <w:tcPr>
+            <w:tcW w:type="dxa" w:w="4824"/>
+          </w:tcPr>
+          <w:p>
+            <w:r/>
+            <w:r>
+              <w:rPr>
+                <w:rFonts w:ascii="Calibri" w:hAnsi="Calibri" w:eastAsia="Microsoft JhengHei"/>
+                <w:b/>
+                <w:sz w:val="20"/>
+              </w:rPr>
+              <w:t>Outcome</w:t>
+            </w:r>
+          </w:p>
+        </w:tc>
+        <w:tc>
+          <w:tcPr>
+            <w:tcW w:type="dxa" w:w="4824"/>
+          </w:tcPr>
+          <w:p>
+            <w:r/>
+            <w:r>
+              <w:rPr>
+                <w:rFonts w:ascii="Calibri" w:hAnsi="Calibri" w:eastAsia="Microsoft JhengHei"/>
+                <w:b/>
+                <w:sz w:val="20"/>
+              </w:rPr>
+              <w:t>Meaning</w:t>
+            </w:r>
+          </w:p>
+        </w:tc>
+      </w:tr>
+      <w:tr>
+        <w:tc>
+          <w:tcPr>
+            <w:tcW w:type="dxa" w:w="4824"/>
+          </w:tcPr>
+          <w:p>
+            <w:r/>
+            <w:r>
+              <w:rPr>
+                <w:rFonts w:ascii="Calibri" w:hAnsi="Calibri" w:eastAsia="Microsoft JhengHei"/>
+                <w:sz w:val="20"/>
+              </w:rPr>
+              <w:t>Manual OK, auto missing</w:t>
+            </w:r>
+          </w:p>
+        </w:tc>
+        <w:tc>
+          <w:tcPr>
+            <w:tcW w:type="dxa" w:w="4824"/>
+          </w:tcPr>
+          <w:p>
+            <w:r/>
+            <w:r>
+              <w:rPr>
+                <w:rFonts w:ascii="Calibri" w:hAnsi="Calibri" w:eastAsia="Microsoft JhengHei"/>
+                <w:sz w:val="20"/>
+              </w:rPr>
+              <w:t>cron-job.org issue, not the download script</w:t>
+            </w:r>
+          </w:p>
+        </w:tc>
+      </w:tr>
+      <w:tr>
+        <w:tc>
+          <w:tcPr>
+            <w:tcW w:type="dxa" w:w="4824"/>
+          </w:tcPr>
+          <w:p>
+            <w:r/>
+            <w:r>
+              <w:rPr>
+                <w:rFonts w:ascii="Calibri" w:hAnsi="Calibri" w:eastAsia="Microsoft JhengHei"/>
+                <w:sz w:val="20"/>
+              </w:rPr>
+              <w:t>Manual also fails</w:t>
+            </w:r>
+          </w:p>
+        </w:tc>
+        <w:tc>
+          <w:tcPr>
+            <w:tcW w:type="dxa" w:w="4824"/>
+          </w:tcPr>
+          <w:p>
+            <w:r/>
+            <w:r>
+              <w:rPr>
+                <w:rFonts w:ascii="Calibri" w:hAnsi="Calibri" w:eastAsia="Microsoft JhengHei"/>
+                <w:sz w:val="20"/>
+              </w:rPr>
+              <w:t>inspect Actions logs</w:t>
+            </w:r>
+          </w:p>
+        </w:tc>
+      </w:tr>
+    </w:tbl>
+    <w:p/>
+    <w:p>
+      <w:pPr>
+        <w:pStyle w:val="Heading3"/>
+      </w:pPr>
+      <w:r>
+        <w:rPr>
+          <w:rFonts w:ascii="Calibri" w:hAnsi="Calibri" w:eastAsia="Microsoft JhengHei"/>
+          <w:b/>
+          <w:sz w:val="24"/>
+        </w:rPr>
+        <w:t>⑤ Weekly checklist</w:t>
+      </w:r>
+    </w:p>
+    <w:p>
+      <w:pPr>
+        <w:pStyle w:val="ListBullet"/>
+      </w:pPr>
+      <w:r>
+        <w:rPr>
+          <w:rFonts w:ascii="Calibri" w:hAnsi="Calibri" w:eastAsia="Microsoft JhengHei"/>
+          <w:sz w:val="22"/>
+        </w:rPr>
+        <w:t xml:space="preserve">[ ] Weekday </w:t>
+      </w:r>
+      <w:r>
+        <w:rPr>
+          <w:rFonts w:ascii="Consolas" w:hAnsi="Consolas" w:eastAsia="Consolas"/>
+          <w:color w:val="333333"/>
+          <w:sz w:val="22"/>
+        </w:rPr>
+        <w:t>workflow_dispatch</w:t>
+      </w:r>
+      <w:r>
+        <w:rPr>
+          <w:rFonts w:ascii="Calibri" w:hAnsi="Calibri" w:eastAsia="Microsoft JhengHei"/>
+          <w:sz w:val="22"/>
+        </w:rPr>
+        <w:t xml:space="preserve"> successes in Actions</w:t>
+      </w:r>
+    </w:p>
+    <w:p>
+      <w:pPr>
+        <w:pStyle w:val="ListBullet"/>
+      </w:pPr>
+      <w:r>
+        <w:rPr>
+          <w:rFonts w:ascii="Calibri" w:hAnsi="Calibri" w:eastAsia="Microsoft JhengHei"/>
+          <w:sz w:val="22"/>
+        </w:rPr>
+        <w:t xml:space="preserve">[ ] cron-job.org History shows </w:t>
+      </w:r>
+      <w:r>
+        <w:rPr>
+          <w:rFonts w:ascii="Calibri" w:hAnsi="Calibri" w:eastAsia="Microsoft JhengHei"/>
+          <w:b/>
+          <w:sz w:val="22"/>
+        </w:rPr>
+        <w:t>204</w:t>
+      </w:r>
+    </w:p>
+    <w:p>
+      <w:pPr>
+        <w:pStyle w:val="ListBullet"/>
+      </w:pPr>
+      <w:r>
+        <w:rPr>
+          <w:rFonts w:ascii="Calibri" w:hAnsi="Calibri" w:eastAsia="Microsoft JhengHei"/>
+          <w:sz w:val="22"/>
+        </w:rPr>
+        <w:t xml:space="preserve">[ ] (optional) CDN </w:t>
+      </w:r>
+      <w:r>
+        <w:rPr>
+          <w:rFonts w:ascii="Consolas" w:hAnsi="Consolas" w:eastAsia="Consolas"/>
+          <w:color w:val="333333"/>
+          <w:sz w:val="22"/>
+        </w:rPr>
+        <w:t>fetchedAtUtc</w:t>
+      </w:r>
+      <w:r>
+        <w:rPr>
+          <w:rFonts w:ascii="Calibri" w:hAnsi="Calibri" w:eastAsia="Microsoft JhengHei"/>
+          <w:sz w:val="22"/>
+        </w:rPr>
+        <w:t xml:space="preserve"> looks reasonable</w:t>
+      </w:r>
+    </w:p>
+    <w:p>
+      <w:r>
+        <w:rPr>
+          <w:rFonts w:ascii="Calibri" w:hAnsi="Calibri" w:eastAsia="Microsoft JhengHei"/>
+          <w:sz w:val="22"/>
+        </w:rPr>
+        <w:t xml:space="preserve">Full triage when nothing runs: </w:t>
+      </w:r>
+      <w:r>
+        <w:rPr>
+          <w:rFonts w:ascii="Calibri" w:hAnsi="Calibri" w:eastAsia="Microsoft JhengHei"/>
+          <w:b/>
+          <w:sz w:val="22"/>
+        </w:rPr>
+        <w:t>§0.2</w:t>
+      </w:r>
+      <w:r>
+        <w:rPr>
+          <w:rFonts w:ascii="Calibri" w:hAnsi="Calibri" w:eastAsia="Microsoft JhengHei"/>
+          <w:sz w:val="22"/>
+        </w:rPr>
+        <w:t>.</w:t>
+      </w:r>
+    </w:p>
+    <w:p>
+      <w:pPr>
+        <w:pBdr>
+          <w:bottom w:val="single" w:sz="6" w:space="1" w:color="AAAAAA"/>
+        </w:pBdr>
+      </w:pPr>
+    </w:p>
+    <w:p>
+      <w:pPr>
+        <w:pStyle w:val="Heading2"/>
+      </w:pPr>
+      <w:r>
+        <w:rPr>
+          <w:rFonts w:ascii="Calibri" w:hAnsi="Calibri" w:eastAsia="Microsoft JhengHei"/>
+          <w:b/>
+          <w:sz w:val="28"/>
+        </w:rPr>
         <w:t>1. Recommended external cron (cron-job.org, free)</w:t>
       </w:r>
     </w:p>

</xml_diff>